<commit_message>
Update Word project report to full 14-section rubric-aligned structure
</commit_message>
<xml_diff>
--- a/MLBA_Assignment_2_Project_Report.docx
+++ b/MLBA_Assignment_2_Project_Report.docx
@@ -11,23 +11,23 @@
           <w:rFonts w:ascii="Calibri" w:hAnsi="Calibri"/>
           <w:b/>
           <w:color w:val="1E3A8A"/>
-          <w:sz w:val="44"/>
+          <w:sz w:val="48"/>
         </w:rPr>
-        <w:t>MLBA Assignment 2: Project Report &amp; Methodology</w:t>
+        <w:t>MLBA Assignment 2: Project Report</w:t>
       </w:r>
     </w:p>
     <w:p>
       <w:pPr>
-        <w:spacing w:after="280"/>
+        <w:spacing w:after="240"/>
       </w:pPr>
       <w:r>
         <w:rPr>
           <w:rFonts w:ascii="Calibri" w:hAnsi="Calibri"/>
           <w:i/>
-          <w:color w:val="4B5563"/>
+          <w:color w:val="64748B"/>
           <w:sz w:val="28"/>
         </w:rPr>
-        <w:t>AI-Driven Credit Risk Assessment &amp; Underwriting Decision Support System</w:t>
+        <w:t>AI-Driven Credit Default Risk Analyzer: Decision Support System for Retail Underwriting</w:t>
       </w:r>
     </w:p>
     <w:p>
@@ -37,12 +37,14 @@
       <w:r>
         <w:rPr>
           <w:rFonts w:ascii="Calibri" w:hAnsi="Calibri"/>
-          <w:color w:val="64748B"/>
+          <w:color w:val="475569"/>
           <w:sz w:val="20"/>
         </w:rPr>
-        <w:t>Course: Machine Learning for Business Applications (MLBA) | MBA – Business Analytics</w:t>
+        <w:t>Course: Machine Learning for Business Applications (MLBA) | Program: MBA – Business Analytics</w:t>
         <w:br/>
-        <w:t>Repository: https://github.com/Akshit226/streamlit-app-MLBA-02-</w:t>
+        <w:t>GitHub Repository: https://github.com/Akshit226/streamlit-app-MLBA-02-</w:t>
+        <w:br/>
+        <w:t>Live Application: https://streamlit-app-mlba-02.streamlit.app</w:t>
       </w:r>
     </w:p>
     <w:p>
@@ -56,7 +58,7 @@
           <w:color w:val="1E3A8A"/>
           <w:sz w:val="28"/>
         </w:rPr>
-        <w:t>1. Executive Summary &amp; Objective</w:t>
+        <w:t>1. Introduction</w:t>
       </w:r>
     </w:p>
     <w:p>
@@ -68,7 +70,7 @@
           <w:rFonts w:ascii="Calibri" w:hAnsi="Calibri"/>
           <w:sz w:val="22"/>
         </w:rPr>
-        <w:t>This project develops and deploys an end-to-end Machine Learning Decision Support System for retail banking credit risk. Designed for loan officers, the tool evaluates applicant financial and demographic characteristics to quantify default probability, mitigates credit risk exposure, and recommends actionable underwriting tiers. Rather than treating prediction purely as an academic classification exercise, the system is engineered around the asymmetric cost structure of loan defaults.</w:t>
+        <w:t>Retail and commercial lending constitutes the primary revenue generator for banking institutions, operating on net interest margins. However, lending involves intrinsic credit default risk. When borrowers fail to fulfill contractual debt service obligations, banks accumulate Non-Performing Assets (NPAs), which directly impair Tier-1 regulatory capital reserves. This project develops an end-to-end Machine Learning Decision Support System, titled "Apex Underwrite", deployed via Streamlit to empower loan underwriters with real-time risk stratification and prescriptive credit decisions.</w:t>
       </w:r>
     </w:p>
     <w:p>
@@ -94,7 +96,7 @@
           <w:rFonts w:ascii="Calibri" w:hAnsi="Calibri"/>
           <w:sz w:val="22"/>
         </w:rPr>
-        <w:t>Retail lenders generate margin by disbursing loans while seeking to minimize Non-Performing Assets (NPAs). When underwriting, the institution faces two distinct error types:</w:t>
+        <w:t>Commercial credit underwriting presents an asymmetric cost matrix between false predictions:</w:t>
       </w:r>
     </w:p>
     <w:p>
@@ -108,14 +110,14 @@
           <w:b/>
           <w:sz w:val="22"/>
         </w:rPr>
-        <w:t xml:space="preserve">False Negative (Costly): </w:t>
+        <w:t xml:space="preserve">False Negative (Type II Error - Severe Capital Loss): </w:t>
       </w:r>
       <w:r>
         <w:rPr>
           <w:rFonts w:ascii="Calibri" w:hAnsi="Calibri"/>
           <w:sz w:val="22"/>
         </w:rPr>
-        <w:t>Approving an applicant who eventually defaults. The bank loses the entire principal amount plus recovery costs.</w:t>
+        <w:t>Approving a loan to a borrower who defaults. The bank loses 100% of unrecovered principal plus collection and legal recovery costs ($5,000 to $10,000+ per occurrence).</w:t>
       </w:r>
     </w:p>
     <w:p>
@@ -129,14 +131,14 @@
           <w:b/>
           <w:sz w:val="22"/>
         </w:rPr>
-        <w:t xml:space="preserve">False Positive (Opportunity Cost): </w:t>
+        <w:t xml:space="preserve">False Positive (Type I Error - Opportunity Cost): </w:t>
       </w:r>
       <w:r>
         <w:rPr>
           <w:rFonts w:ascii="Calibri" w:hAnsi="Calibri"/>
           <w:sz w:val="22"/>
         </w:rPr>
-        <w:t>Rejecting a creditworthy applicant. The bank loses the interest margin and risks customer relationship friction.</w:t>
+        <w:t>Rejecting a creditworthy borrower. The bank forfeits the net interest margin (e.g., 6% to 10%) and risks customer churn.</w:t>
       </w:r>
     </w:p>
     <w:p>
@@ -148,7 +150,7 @@
           <w:rFonts w:ascii="Calibri" w:hAnsi="Calibri"/>
           <w:sz w:val="22"/>
         </w:rPr>
-        <w:t>Because default write-offs severely deplete Tier-1 bank capital, the analytical objective prioritizes Recall on Defaulters over raw unweighted accuracy.</w:t>
+        <w:t>Analytics Objective: Build a binary classification system calibrated to maximize Recall on Defaulters, catching high-risk applicants before funds are disbursed, while maintaining viable business approval rates.</w:t>
       </w:r>
     </w:p>
     <w:p>
@@ -174,7 +176,770 @@
           <w:rFonts w:ascii="Calibri" w:hAnsi="Calibri"/>
           <w:sz w:val="22"/>
         </w:rPr>
-        <w:t>The project utilizes the benchmark Statlog German Credit Data (UCI Machine Learning Repository / OpenML):</w:t>
+        <w:t>The project leverages the benchmark Statlog German Credit Dataset from the UCI Machine Learning Repository / OpenML:</w:t>
+      </w:r>
+    </w:p>
+    <w:p>
+      <w:pPr>
+        <w:pStyle w:val="ListBullet"/>
+        <w:spacing w:after="60" w:line="276" w:lineRule="auto"/>
+      </w:pPr>
+      <w:r>
+        <w:rPr>
+          <w:rFonts w:ascii="Calibri" w:hAnsi="Calibri"/>
+          <w:b/>
+          <w:sz w:val="22"/>
+        </w:rPr>
+        <w:t xml:space="preserve">Dataset Size: </w:t>
+      </w:r>
+      <w:r>
+        <w:rPr>
+          <w:rFonts w:ascii="Calibri" w:hAnsi="Calibri"/>
+          <w:sz w:val="22"/>
+        </w:rPr>
+        <w:t>1,000 historical bank credit applicant records.</w:t>
+      </w:r>
+    </w:p>
+    <w:p>
+      <w:pPr>
+        <w:pStyle w:val="ListBullet"/>
+        <w:spacing w:after="60" w:line="276" w:lineRule="auto"/>
+      </w:pPr>
+      <w:r>
+        <w:rPr>
+          <w:rFonts w:ascii="Calibri" w:hAnsi="Calibri"/>
+          <w:b/>
+          <w:sz w:val="22"/>
+        </w:rPr>
+        <w:t xml:space="preserve">Feature Dimensionality: </w:t>
+      </w:r>
+      <w:r>
+        <w:rPr>
+          <w:rFonts w:ascii="Calibri" w:hAnsi="Calibri"/>
+          <w:sz w:val="22"/>
+        </w:rPr>
+        <w:t>20 original attributes encompassing financial liquidity, credit history, loan terms, and demographic indicators.</w:t>
+      </w:r>
+    </w:p>
+    <w:p>
+      <w:pPr>
+        <w:pStyle w:val="ListBullet"/>
+        <w:spacing w:after="60" w:line="276" w:lineRule="auto"/>
+      </w:pPr>
+      <w:r>
+        <w:rPr>
+          <w:rFonts w:ascii="Calibri" w:hAnsi="Calibri"/>
+          <w:b/>
+          <w:sz w:val="22"/>
+        </w:rPr>
+        <w:t xml:space="preserve">Target Variable: </w:t>
+      </w:r>
+      <w:r>
+        <w:rPr>
+          <w:rFonts w:ascii="Calibri" w:hAnsi="Calibri"/>
+          <w:sz w:val="22"/>
+        </w:rPr>
+        <w:t>class — 700 Good repayers (70.0%, encoded as 0) and 300 Bad defaulters (30.0%, encoded as 1).</w:t>
+      </w:r>
+    </w:p>
+    <w:p>
+      <w:pPr>
+        <w:pStyle w:val="ListBullet"/>
+        <w:spacing w:after="60" w:line="276" w:lineRule="auto"/>
+      </w:pPr>
+      <w:r>
+        <w:rPr>
+          <w:rFonts w:ascii="Calibri" w:hAnsi="Calibri"/>
+          <w:b/>
+          <w:sz w:val="22"/>
+        </w:rPr>
+        <w:t xml:space="preserve">Selected Features: </w:t>
+      </w:r>
+      <w:r>
+        <w:rPr>
+          <w:rFonts w:ascii="Calibri" w:hAnsi="Calibri"/>
+          <w:sz w:val="22"/>
+        </w:rPr>
+        <w:t>8 high-signal, operationally verifiable predictors: checking_status, duration, credit_amount, savings_status, employment, age, housing, and purpose.</w:t>
+      </w:r>
+    </w:p>
+    <w:p>
+      <w:pPr>
+        <w:spacing w:before="280" w:after="80"/>
+      </w:pPr>
+      <w:r>
+        <w:rPr>
+          <w:rFonts w:ascii="Calibri" w:hAnsi="Calibri"/>
+          <w:b/>
+          <w:color w:val="1E3A8A"/>
+          <w:sz w:val="28"/>
+        </w:rPr>
+        <w:t>4. Data Preparation &amp; Cleaning</w:t>
+      </w:r>
+    </w:p>
+    <w:p>
+      <w:pPr>
+        <w:spacing w:after="120" w:line="276" w:lineRule="auto"/>
+      </w:pPr>
+      <w:r>
+        <w:rPr>
+          <w:rFonts w:ascii="Calibri" w:hAnsi="Calibri"/>
+          <w:sz w:val="22"/>
+        </w:rPr>
+        <w:t>Raw data was ingested and preprocessed using a leak-free Scikit-Learn ColumnTransformer pipeline:</w:t>
+      </w:r>
+    </w:p>
+    <w:p>
+      <w:pPr>
+        <w:pStyle w:val="ListBullet"/>
+        <w:spacing w:after="60" w:line="276" w:lineRule="auto"/>
+      </w:pPr>
+      <w:r>
+        <w:rPr>
+          <w:rFonts w:ascii="Calibri" w:hAnsi="Calibri"/>
+          <w:b/>
+          <w:sz w:val="22"/>
+        </w:rPr>
+        <w:t xml:space="preserve">Handling Class Imbalance: </w:t>
+      </w:r>
+      <w:r>
+        <w:rPr>
+          <w:rFonts w:ascii="Calibri" w:hAnsi="Calibri"/>
+          <w:sz w:val="22"/>
+        </w:rPr>
+        <w:t>Class distribution shows a 70/30 split. Stratified sampling was applied during train/test partitioning to preserve identical class ratios.</w:t>
+      </w:r>
+    </w:p>
+    <w:p>
+      <w:pPr>
+        <w:pStyle w:val="ListBullet"/>
+        <w:spacing w:after="60" w:line="276" w:lineRule="auto"/>
+      </w:pPr>
+      <w:r>
+        <w:rPr>
+          <w:rFonts w:ascii="Calibri" w:hAnsi="Calibri"/>
+          <w:b/>
+          <w:sz w:val="22"/>
+        </w:rPr>
+        <w:t xml:space="preserve">Continuous Feature Scaling: </w:t>
+      </w:r>
+      <w:r>
+        <w:rPr>
+          <w:rFonts w:ascii="Calibri" w:hAnsi="Calibri"/>
+          <w:sz w:val="22"/>
+        </w:rPr>
+        <w:t>duration, credit_amount, and age were scaled via StandardScaler to prevent large numerical ranges from dominating gradient updates.</w:t>
+      </w:r>
+    </w:p>
+    <w:p>
+      <w:pPr>
+        <w:pStyle w:val="ListBullet"/>
+        <w:spacing w:after="60" w:line="276" w:lineRule="auto"/>
+      </w:pPr>
+      <w:r>
+        <w:rPr>
+          <w:rFonts w:ascii="Calibri" w:hAnsi="Calibri"/>
+          <w:b/>
+          <w:sz w:val="22"/>
+        </w:rPr>
+        <w:t xml:space="preserve">Categorical Encoding: </w:t>
+      </w:r>
+      <w:r>
+        <w:rPr>
+          <w:rFonts w:ascii="Calibri" w:hAnsi="Calibri"/>
+          <w:sz w:val="22"/>
+        </w:rPr>
+        <w:t>Categorical features (checking status, savings status, employment, housing, purpose) were transformed via OneHotEncoder with handle_unknown="ignore" to ensure production robustness.</w:t>
+      </w:r>
+    </w:p>
+    <w:p>
+      <w:pPr>
+        <w:pStyle w:val="ListBullet"/>
+        <w:spacing w:after="60" w:line="276" w:lineRule="auto"/>
+      </w:pPr>
+      <w:r>
+        <w:rPr>
+          <w:rFonts w:ascii="Calibri" w:hAnsi="Calibri"/>
+          <w:b/>
+          <w:sz w:val="22"/>
+        </w:rPr>
+        <w:t xml:space="preserve">Validation Split: </w:t>
+      </w:r>
+      <w:r>
+        <w:rPr>
+          <w:rFonts w:ascii="Calibri" w:hAnsi="Calibri"/>
+          <w:sz w:val="22"/>
+        </w:rPr>
+        <w:t>An 80/20 stratified split partitioned 800 training applicants and 200 holdout test records.</w:t>
+      </w:r>
+    </w:p>
+    <w:p>
+      <w:pPr>
+        <w:spacing w:before="280" w:after="80"/>
+      </w:pPr>
+      <w:r>
+        <w:rPr>
+          <w:rFonts w:ascii="Calibri" w:hAnsi="Calibri"/>
+          <w:b/>
+          <w:color w:val="1E3A8A"/>
+          <w:sz w:val="28"/>
+        </w:rPr>
+        <w:t>5. Exploratory Data Analysis (EDA)</w:t>
+      </w:r>
+    </w:p>
+    <w:p>
+      <w:pPr>
+        <w:spacing w:after="120" w:line="276" w:lineRule="auto"/>
+      </w:pPr>
+      <w:r>
+        <w:rPr>
+          <w:rFonts w:ascii="Calibri" w:hAnsi="Calibri"/>
+          <w:sz w:val="22"/>
+        </w:rPr>
+        <w:t>Empirical analysis of historical data revealed three primary solvency signals:</w:t>
+      </w:r>
+    </w:p>
+    <w:p>
+      <w:pPr>
+        <w:pStyle w:val="ListBullet"/>
+        <w:spacing w:after="60" w:line="276" w:lineRule="auto"/>
+      </w:pPr>
+      <w:r>
+        <w:rPr>
+          <w:rFonts w:ascii="Calibri" w:hAnsi="Calibri"/>
+          <w:b/>
+          <w:sz w:val="22"/>
+        </w:rPr>
+        <w:t xml:space="preserve">Signal 1: Checking Account Liquidity (#1 Risk Factor): </w:t>
+      </w:r>
+      <w:r>
+        <w:rPr>
+          <w:rFonts w:ascii="Calibri" w:hAnsi="Calibri"/>
+          <w:sz w:val="22"/>
+        </w:rPr>
+        <w:t>Applicants with negative or overdrawn checking balances (&lt; 0 DM) experienced default rates approaching 49.3%, whereas applicants maintaining &gt;= 200 DM defaulted at under 14.5%.</w:t>
+      </w:r>
+    </w:p>
+    <w:p>
+      <w:pPr>
+        <w:pStyle w:val="ListBullet"/>
+        <w:spacing w:after="60" w:line="276" w:lineRule="auto"/>
+      </w:pPr>
+      <w:r>
+        <w:rPr>
+          <w:rFonts w:ascii="Calibri" w:hAnsi="Calibri"/>
+          <w:b/>
+          <w:sz w:val="22"/>
+        </w:rPr>
+        <w:t xml:space="preserve">Signal 2: Amortization Horizon: </w:t>
+      </w:r>
+      <w:r>
+        <w:rPr>
+          <w:rFonts w:ascii="Calibri" w:hAnsi="Calibri"/>
+          <w:sz w:val="22"/>
+        </w:rPr>
+        <w:t>Median loan duration for defaulters was 30 months compared to 18 months for repayers. Extended tenure compounds exposure to life shocks (unemployment, illness).</w:t>
+      </w:r>
+    </w:p>
+    <w:p>
+      <w:pPr>
+        <w:pStyle w:val="ListBullet"/>
+        <w:spacing w:after="60" w:line="276" w:lineRule="auto"/>
+      </w:pPr>
+      <w:r>
+        <w:rPr>
+          <w:rFonts w:ascii="Calibri" w:hAnsi="Calibri"/>
+          <w:b/>
+          <w:sz w:val="22"/>
+        </w:rPr>
+        <w:t xml:space="preserve">Signal 3: Savings Buffer Resilience: </w:t>
+      </w:r>
+      <w:r>
+        <w:rPr>
+          <w:rFonts w:ascii="Calibri" w:hAnsi="Calibri"/>
+          <w:sz w:val="22"/>
+        </w:rPr>
+        <w:t>Applicants with savings &gt;= 1,000 DM maintained robust repayment even when requesting large credit amounts.</w:t>
+      </w:r>
+    </w:p>
+    <w:p>
+      <w:pPr>
+        <w:spacing w:before="280" w:after="80"/>
+      </w:pPr>
+      <w:r>
+        <w:rPr>
+          <w:rFonts w:ascii="Calibri" w:hAnsi="Calibri"/>
+          <w:b/>
+          <w:color w:val="1E3A8A"/>
+          <w:sz w:val="28"/>
+        </w:rPr>
+        <w:t>6. Machine Learning Methodology</w:t>
+      </w:r>
+    </w:p>
+    <w:p>
+      <w:pPr>
+        <w:spacing w:after="120" w:line="276" w:lineRule="auto"/>
+      </w:pPr>
+      <w:r>
+        <w:rPr>
+          <w:rFonts w:ascii="Calibri" w:hAnsi="Calibri"/>
+          <w:sz w:val="22"/>
+        </w:rPr>
+        <w:t>We evaluated multiple classifiers and selected Random Forest Classifier (n_estimators=100, max_depth=6) as the production estimator for several core reasons:</w:t>
+      </w:r>
+    </w:p>
+    <w:p>
+      <w:pPr>
+        <w:pStyle w:val="ListBullet"/>
+        <w:spacing w:after="60" w:line="276" w:lineRule="auto"/>
+      </w:pPr>
+      <w:r>
+        <w:rPr>
+          <w:rFonts w:ascii="Calibri" w:hAnsi="Calibri"/>
+          <w:b/>
+          <w:sz w:val="22"/>
+        </w:rPr>
+        <w:t xml:space="preserve">Non-Linearity &amp; Interactions: </w:t>
+      </w:r>
+      <w:r>
+        <w:rPr>
+          <w:rFonts w:ascii="Calibri" w:hAnsi="Calibri"/>
+          <w:sz w:val="22"/>
+        </w:rPr>
+        <w:t>Credit risk involves complex multi-way interactions (e.g., high loan amount coupled with low savings). Tree ensembles naturally capture non-linear relationships without manual feature polynomialization.</w:t>
+      </w:r>
+    </w:p>
+    <w:p>
+      <w:pPr>
+        <w:pStyle w:val="ListBullet"/>
+        <w:spacing w:after="60" w:line="276" w:lineRule="auto"/>
+      </w:pPr>
+      <w:r>
+        <w:rPr>
+          <w:rFonts w:ascii="Calibri" w:hAnsi="Calibri"/>
+          <w:b/>
+          <w:sz w:val="22"/>
+        </w:rPr>
+        <w:t xml:space="preserve">Robustness to Outliers: </w:t>
+      </w:r>
+      <w:r>
+        <w:rPr>
+          <w:rFonts w:ascii="Calibri" w:hAnsi="Calibri"/>
+          <w:sz w:val="22"/>
+        </w:rPr>
+        <w:t>Tree partitioning is invariant to monotonic transformations, preventing extreme loan amounts from skewing decision boundaries.</w:t>
+      </w:r>
+    </w:p>
+    <w:p>
+      <w:pPr>
+        <w:pStyle w:val="ListBullet"/>
+        <w:spacing w:after="60" w:line="276" w:lineRule="auto"/>
+      </w:pPr>
+      <w:r>
+        <w:rPr>
+          <w:rFonts w:ascii="Calibri" w:hAnsi="Calibri"/>
+          <w:b/>
+          <w:sz w:val="22"/>
+        </w:rPr>
+        <w:t xml:space="preserve">Balanced Class Weighting: </w:t>
+      </w:r>
+      <w:r>
+        <w:rPr>
+          <w:rFonts w:ascii="Calibri" w:hAnsi="Calibri"/>
+          <w:sz w:val="22"/>
+        </w:rPr>
+        <w:t>Configured with class_weight="balanced", assigning dynamic loss penalties (w_bad ≈ 1.67 vs w_good ≈ 0.71). This penalizes misclassified defaulters 2.35x more heavily than false alarms.</w:t>
+      </w:r>
+    </w:p>
+    <w:p>
+      <w:pPr>
+        <w:spacing w:before="280" w:after="80"/>
+      </w:pPr>
+      <w:r>
+        <w:rPr>
+          <w:rFonts w:ascii="Calibri" w:hAnsi="Calibri"/>
+          <w:b/>
+          <w:color w:val="1E3A8A"/>
+          <w:sz w:val="28"/>
+        </w:rPr>
+        <w:t>7. Model Evaluation &amp; Performance</w:t>
+      </w:r>
+    </w:p>
+    <w:p>
+      <w:pPr>
+        <w:spacing w:after="120" w:line="276" w:lineRule="auto"/>
+      </w:pPr>
+      <w:r>
+        <w:rPr>
+          <w:rFonts w:ascii="Calibri" w:hAnsi="Calibri"/>
+          <w:sz w:val="22"/>
+        </w:rPr>
+        <w:t>The model was evaluated on the 200 unseen holdout applicants (140 Good, 60 Bad):</w:t>
+      </w:r>
+    </w:p>
+    <w:p>
+      <w:pPr>
+        <w:pStyle w:val="ListBullet"/>
+        <w:spacing w:after="60" w:line="276" w:lineRule="auto"/>
+      </w:pPr>
+      <w:r>
+        <w:rPr>
+          <w:rFonts w:ascii="Calibri" w:hAnsi="Calibri"/>
+          <w:b/>
+          <w:sz w:val="22"/>
+        </w:rPr>
+        <w:t xml:space="preserve">Defaulter Recall (Primary KPI): </w:t>
+      </w:r>
+      <w:r>
+        <w:rPr>
+          <w:rFonts w:ascii="Calibri" w:hAnsi="Calibri"/>
+          <w:sz w:val="22"/>
+        </w:rPr>
+        <w:t>71.7% (Successfully flagged 43 out of 60 actual defaulters).</w:t>
+      </w:r>
+    </w:p>
+    <w:p>
+      <w:pPr>
+        <w:pStyle w:val="ListBullet"/>
+        <w:spacing w:after="60" w:line="276" w:lineRule="auto"/>
+      </w:pPr>
+      <w:r>
+        <w:rPr>
+          <w:rFonts w:ascii="Calibri" w:hAnsi="Calibri"/>
+          <w:b/>
+          <w:sz w:val="22"/>
+        </w:rPr>
+        <w:t xml:space="preserve">Overall Accuracy: </w:t>
+      </w:r>
+      <w:r>
+        <w:rPr>
+          <w:rFonts w:ascii="Calibri" w:hAnsi="Calibri"/>
+          <w:sz w:val="22"/>
+        </w:rPr>
+        <w:t>70.0% (140 correct classifications out of 200).</w:t>
+      </w:r>
+    </w:p>
+    <w:p>
+      <w:pPr>
+        <w:pStyle w:val="ListBullet"/>
+        <w:spacing w:after="60" w:line="276" w:lineRule="auto"/>
+      </w:pPr>
+      <w:r>
+        <w:rPr>
+          <w:rFonts w:ascii="Calibri" w:hAnsi="Calibri"/>
+          <w:b/>
+          <w:sz w:val="22"/>
+        </w:rPr>
+        <w:t xml:space="preserve">Defaulter Precision: </w:t>
+      </w:r>
+      <w:r>
+        <w:rPr>
+          <w:rFonts w:ascii="Calibri" w:hAnsi="Calibri"/>
+          <w:sz w:val="22"/>
+        </w:rPr>
+        <w:t>50.0% (43 True Positives vs. 43 False Positives).</w:t>
+      </w:r>
+    </w:p>
+    <w:p>
+      <w:pPr>
+        <w:pStyle w:val="ListBullet"/>
+        <w:spacing w:after="60" w:line="276" w:lineRule="auto"/>
+      </w:pPr>
+      <w:r>
+        <w:rPr>
+          <w:rFonts w:ascii="Calibri" w:hAnsi="Calibri"/>
+          <w:b/>
+          <w:sz w:val="22"/>
+        </w:rPr>
+        <w:t xml:space="preserve">F1-Score: </w:t>
+      </w:r>
+      <w:r>
+        <w:rPr>
+          <w:rFonts w:ascii="Calibri" w:hAnsi="Calibri"/>
+          <w:sz w:val="22"/>
+        </w:rPr>
+        <w:t>0.589.</w:t>
+      </w:r>
+    </w:p>
+    <w:p>
+      <w:pPr>
+        <w:pStyle w:val="ListBullet"/>
+        <w:spacing w:after="60" w:line="276" w:lineRule="auto"/>
+      </w:pPr>
+      <w:r>
+        <w:rPr>
+          <w:rFonts w:ascii="Calibri" w:hAnsi="Calibri"/>
+          <w:b/>
+          <w:sz w:val="22"/>
+        </w:rPr>
+        <w:t xml:space="preserve">Confusion Matrix Breakdown: </w:t>
+      </w:r>
+      <w:r>
+        <w:rPr>
+          <w:rFonts w:ascii="Calibri" w:hAnsi="Calibri"/>
+          <w:sz w:val="22"/>
+        </w:rPr>
+        <w:t>True Negatives: 97 | False Positives: 43 | False Negatives: 17 | True Positives: 43.</w:t>
+      </w:r>
+    </w:p>
+    <w:p>
+      <w:pPr>
+        <w:spacing w:after="120" w:line="276" w:lineRule="auto"/>
+      </w:pPr>
+      <w:r>
+        <w:rPr>
+          <w:rFonts w:ascii="Calibri" w:hAnsi="Calibri"/>
+          <w:sz w:val="22"/>
+        </w:rPr>
+        <w:t>Crucially, False Negatives were restricted to only 17 cases out of 60, successfully preventing over 71% of potential credit losses.</w:t>
+      </w:r>
+    </w:p>
+    <w:p>
+      <w:pPr>
+        <w:spacing w:before="280" w:after="80"/>
+      </w:pPr>
+      <w:r>
+        <w:rPr>
+          <w:rFonts w:ascii="Calibri" w:hAnsi="Calibri"/>
+          <w:b/>
+          <w:color w:val="1E3A8A"/>
+          <w:sz w:val="28"/>
+        </w:rPr>
+        <w:t>8. Streamlit Application Architecture</w:t>
+      </w:r>
+    </w:p>
+    <w:p>
+      <w:pPr>
+        <w:spacing w:after="120" w:line="276" w:lineRule="auto"/>
+      </w:pPr>
+      <w:r>
+        <w:rPr>
+          <w:rFonts w:ascii="Calibri" w:hAnsi="Calibri"/>
+          <w:sz w:val="22"/>
+        </w:rPr>
+        <w:t>The fitted pipeline was serialized into model.pkl via joblib and embedded within a modern 3-page Streamlit web platform:</w:t>
+      </w:r>
+    </w:p>
+    <w:p>
+      <w:pPr>
+        <w:pStyle w:val="ListBullet"/>
+        <w:spacing w:after="60" w:line="276" w:lineRule="auto"/>
+      </w:pPr>
+      <w:r>
+        <w:rPr>
+          <w:rFonts w:ascii="Calibri" w:hAnsi="Calibri"/>
+          <w:b/>
+          <w:sz w:val="22"/>
+        </w:rPr>
+        <w:t xml:space="preserve">Page 1: Executive Overview: </w:t>
+      </w:r>
+      <w:r>
+        <w:rPr>
+          <w:rFonts w:ascii="Calibri" w:hAnsi="Calibri"/>
+          <w:sz w:val="22"/>
+        </w:rPr>
+        <w:t>Presents the business context, asymmetric cost rationale, and high-level KPI cards.</w:t>
+      </w:r>
+    </w:p>
+    <w:p>
+      <w:pPr>
+        <w:pStyle w:val="ListBullet"/>
+        <w:spacing w:after="60" w:line="276" w:lineRule="auto"/>
+      </w:pPr>
+      <w:r>
+        <w:rPr>
+          <w:rFonts w:ascii="Calibri" w:hAnsi="Calibri"/>
+          <w:b/>
+          <w:sz w:val="22"/>
+        </w:rPr>
+        <w:t xml:space="preserve">Page 2: Portfolio Analytics: </w:t>
+      </w:r>
+      <w:r>
+        <w:rPr>
+          <w:rFonts w:ascii="Calibri" w:hAnsi="Calibri"/>
+          <w:sz w:val="22"/>
+        </w:rPr>
+        <w:t>Interactive data exploration visualizing checking account solvency curves, tenure boxplots, and class distributions.</w:t>
+      </w:r>
+    </w:p>
+    <w:p>
+      <w:pPr>
+        <w:pStyle w:val="ListBullet"/>
+        <w:spacing w:after="60" w:line="276" w:lineRule="auto"/>
+      </w:pPr>
+      <w:r>
+        <w:rPr>
+          <w:rFonts w:ascii="Calibri" w:hAnsi="Calibri"/>
+          <w:b/>
+          <w:sz w:val="22"/>
+        </w:rPr>
+        <w:t xml:space="preserve">Page 3: Underwriting Decision Engine: </w:t>
+      </w:r>
+      <w:r>
+        <w:rPr>
+          <w:rFonts w:ascii="Calibri" w:hAnsi="Calibri"/>
+          <w:sz w:val="22"/>
+        </w:rPr>
+        <w:t>Point-of-sale portal where loan officers input borrower credentials and receive real-time probability scores and triaged directives.</w:t>
+      </w:r>
+    </w:p>
+    <w:p>
+      <w:pPr>
+        <w:spacing w:before="280" w:after="80"/>
+      </w:pPr>
+      <w:r>
+        <w:rPr>
+          <w:rFonts w:ascii="Calibri" w:hAnsi="Calibri"/>
+          <w:b/>
+          <w:color w:val="1E3A8A"/>
+          <w:sz w:val="28"/>
+        </w:rPr>
+        <w:t>9. Cloud Deployment</w:t>
+      </w:r>
+    </w:p>
+    <w:p>
+      <w:pPr>
+        <w:spacing w:after="120" w:line="276" w:lineRule="auto"/>
+      </w:pPr>
+      <w:r>
+        <w:rPr>
+          <w:rFonts w:ascii="Calibri" w:hAnsi="Calibri"/>
+          <w:sz w:val="22"/>
+        </w:rPr>
+        <w:t>The application is version-controlled on GitHub and deployed on Streamlit Community Cloud:</w:t>
+      </w:r>
+    </w:p>
+    <w:p>
+      <w:pPr>
+        <w:pStyle w:val="ListBullet"/>
+        <w:spacing w:after="60" w:line="276" w:lineRule="auto"/>
+      </w:pPr>
+      <w:r>
+        <w:rPr>
+          <w:rFonts w:ascii="Calibri" w:hAnsi="Calibri"/>
+          <w:b/>
+          <w:sz w:val="22"/>
+        </w:rPr>
+        <w:t xml:space="preserve">CI/CD Integration: </w:t>
+      </w:r>
+      <w:r>
+        <w:rPr>
+          <w:rFonts w:ascii="Calibri" w:hAnsi="Calibri"/>
+          <w:sz w:val="22"/>
+        </w:rPr>
+        <w:t>Any commit pushed to the main branch automatically triggers container rebuilding and zero-downtime redeployment.</w:t>
+      </w:r>
+    </w:p>
+    <w:p>
+      <w:pPr>
+        <w:pStyle w:val="ListBullet"/>
+        <w:spacing w:after="60" w:line="276" w:lineRule="auto"/>
+      </w:pPr>
+      <w:r>
+        <w:rPr>
+          <w:rFonts w:ascii="Calibri" w:hAnsi="Calibri"/>
+          <w:b/>
+          <w:sz w:val="22"/>
+        </w:rPr>
+        <w:t xml:space="preserve">Environment Reproducibility: </w:t>
+      </w:r>
+      <w:r>
+        <w:rPr>
+          <w:rFonts w:ascii="Calibri" w:hAnsi="Calibri"/>
+          <w:sz w:val="22"/>
+        </w:rPr>
+        <w:t>dependencies are locked via requirements.txt, ensuring identical execution across cloud runtime environments.</w:t>
+      </w:r>
+    </w:p>
+    <w:p>
+      <w:pPr>
+        <w:spacing w:before="280" w:after="80"/>
+      </w:pPr>
+      <w:r>
+        <w:rPr>
+          <w:rFonts w:ascii="Calibri" w:hAnsi="Calibri"/>
+          <w:b/>
+          <w:color w:val="1E3A8A"/>
+          <w:sz w:val="28"/>
+        </w:rPr>
+        <w:t>10. Key Business Insights</w:t>
+      </w:r>
+    </w:p>
+    <w:p>
+      <w:pPr>
+        <w:pStyle w:val="ListBullet"/>
+        <w:spacing w:after="60" w:line="276" w:lineRule="auto"/>
+      </w:pPr>
+      <w:r>
+        <w:rPr>
+          <w:rFonts w:ascii="Calibri" w:hAnsi="Calibri"/>
+          <w:b/>
+          <w:sz w:val="22"/>
+        </w:rPr>
+        <w:t xml:space="preserve">Insight 1: </w:t>
+      </w:r>
+      <w:r>
+        <w:rPr>
+          <w:rFonts w:ascii="Calibri" w:hAnsi="Calibri"/>
+          <w:sz w:val="22"/>
+        </w:rPr>
+        <w:t>Liquid cash buffers (checking and savings) are far more predictive of short-term credit solvency than demographic age.</w:t>
+      </w:r>
+    </w:p>
+    <w:p>
+      <w:pPr>
+        <w:pStyle w:val="ListBullet"/>
+        <w:spacing w:after="60" w:line="276" w:lineRule="auto"/>
+      </w:pPr>
+      <w:r>
+        <w:rPr>
+          <w:rFonts w:ascii="Calibri" w:hAnsi="Calibri"/>
+          <w:b/>
+          <w:sz w:val="22"/>
+        </w:rPr>
+        <w:t xml:space="preserve">Insight 2: </w:t>
+      </w:r>
+      <w:r>
+        <w:rPr>
+          <w:rFonts w:ascii="Calibri" w:hAnsi="Calibri"/>
+          <w:sz w:val="22"/>
+        </w:rPr>
+        <w:t>Loan tenure is a risk multiplier. Restricting loan horizons to under 24 months reduces default exposure substantially.</w:t>
+      </w:r>
+    </w:p>
+    <w:p>
+      <w:pPr>
+        <w:pStyle w:val="ListBullet"/>
+        <w:spacing w:after="60" w:line="276" w:lineRule="auto"/>
+      </w:pPr>
+      <w:r>
+        <w:rPr>
+          <w:rFonts w:ascii="Calibri" w:hAnsi="Calibri"/>
+          <w:b/>
+          <w:sz w:val="22"/>
+        </w:rPr>
+        <w:t xml:space="preserve">Insight 3: </w:t>
+      </w:r>
+      <w:r>
+        <w:rPr>
+          <w:rFonts w:ascii="Calibri" w:hAnsi="Calibri"/>
+          <w:sz w:val="22"/>
+        </w:rPr>
+        <w:t>Threshold tuning enables banks to adapt to shifting macroeconomic cycles: tightening approval thresholds during recessions and expanding them during expansionary phases.</w:t>
+      </w:r>
+    </w:p>
+    <w:p>
+      <w:pPr>
+        <w:spacing w:before="280" w:after="80"/>
+      </w:pPr>
+      <w:r>
+        <w:rPr>
+          <w:rFonts w:ascii="Calibri" w:hAnsi="Calibri"/>
+          <w:b/>
+          <w:color w:val="1E3A8A"/>
+          <w:sz w:val="28"/>
+        </w:rPr>
+        <w:t>11. Limitations</w:t>
       </w:r>
     </w:p>
     <w:p>
@@ -195,7 +960,7 @@
           <w:rFonts w:ascii="Calibri" w:hAnsi="Calibri"/>
           <w:sz w:val="22"/>
         </w:rPr>
-        <w:t>1,000 historical loan applicants.</w:t>
+        <w:t>The model is trained on 1,000 historical records; commercial enterprise scorecards typically utilize millions of bureau records.</w:t>
       </w:r>
     </w:p>
     <w:p>
@@ -209,14 +974,14 @@
           <w:b/>
           <w:sz w:val="22"/>
         </w:rPr>
-        <w:t xml:space="preserve">Target Variable: </w:t>
+        <w:t xml:space="preserve">Macroeconomic Omission: </w:t>
       </w:r>
       <w:r>
         <w:rPr>
           <w:rFonts w:ascii="Calibri" w:hAnsi="Calibri"/>
           <w:sz w:val="22"/>
         </w:rPr>
-        <w:t>class — 700 Good (70% repayers, encoded 0) and 300 Bad (30% defaulters, encoded 1).</w:t>
+        <w:t>The dataset lacks external macro factors (inflation rate, central bank prime lending rate, regional unemployment rates).</w:t>
       </w:r>
     </w:p>
     <w:p>
@@ -230,14 +995,14 @@
           <w:b/>
           <w:sz w:val="22"/>
         </w:rPr>
-        <w:t xml:space="preserve">Selected Features: </w:t>
+        <w:t xml:space="preserve">Temporal Drift: </w:t>
       </w:r>
       <w:r>
         <w:rPr>
           <w:rFonts w:ascii="Calibri" w:hAnsi="Calibri"/>
           <w:sz w:val="22"/>
         </w:rPr>
-        <w:t>8 key features: checking_status, duration, credit_amount, savings_status, employment, age, housing, and purpose.</w:t>
+        <w:t>Consumer repayment behaviors shift over time; the model requires quarterly performance re-validation.</w:t>
       </w:r>
     </w:p>
     <w:p>
@@ -251,7 +1016,7 @@
           <w:color w:val="1E3A8A"/>
           <w:sz w:val="28"/>
         </w:rPr>
-        <w:t>4. Key Exploratory Data Analysis (EDA) Insights</w:t>
+        <w:t>12. Recommendations for Implementation</w:t>
       </w:r>
     </w:p>
     <w:p>
@@ -265,14 +1030,14 @@
           <w:b/>
           <w:sz w:val="22"/>
         </w:rPr>
-        <w:t xml:space="preserve">Checking Balance (#1 Signal): </w:t>
+        <w:t xml:space="preserve">Human-in-the-Loop Framework: </w:t>
       </w:r>
       <w:r>
         <w:rPr>
           <w:rFonts w:ascii="Calibri" w:hAnsi="Calibri"/>
           <w:sz w:val="22"/>
         </w:rPr>
-        <w:t>Applicants with negative checking balances (&lt; 0 DM) experience default rates approaching ~50%, while balances &gt;= 200 DM default at under 15%.</w:t>
+        <w:t>Deploy as a decision-support tool rather than an autonomous decision-maker.</w:t>
       </w:r>
     </w:p>
     <w:p>
@@ -286,14 +1051,14 @@
           <w:b/>
           <w:sz w:val="22"/>
         </w:rPr>
-        <w:t xml:space="preserve">Tenure Exposure: </w:t>
+        <w:t xml:space="preserve">Triaged Workflow: </w:t>
       </w:r>
       <w:r>
         <w:rPr>
           <w:rFonts w:ascii="Calibri" w:hAnsi="Calibri"/>
           <w:sz w:val="22"/>
         </w:rPr>
-        <w:t>Defaulters hold a median loan duration of 30 months compared to 18 months for repayers, reflecting higher exposure to life shocks over longer horizons.</w:t>
+        <w:t>Automate straight-through processing for Green Tier applicants (&lt;35% risk), while routing Yellow Tier applicants (35%-55%) to senior underwriters for co-signer or collateral verification.</w:t>
       </w:r>
     </w:p>
     <w:p>
@@ -307,14 +1072,14 @@
           <w:b/>
           <w:sz w:val="22"/>
         </w:rPr>
-        <w:t xml:space="preserve">Savings Buffer: </w:t>
+        <w:t xml:space="preserve">Dynamic Pricing: </w:t>
       </w:r>
       <w:r>
         <w:rPr>
           <w:rFonts w:ascii="Calibri" w:hAnsi="Calibri"/>
           <w:sz w:val="22"/>
         </w:rPr>
-        <w:t>Reserves &gt;= 1,000 DM significantly reduce default risk even when borrowing higher credit amounts.</w:t>
+        <w:t>Incorporate risk-based pricing, adding interest rate spreads (e.g., +200 bps) to borderline approvals to compensate for residual credit risk.</w:t>
       </w:r>
     </w:p>
     <w:p>
@@ -328,7 +1093,7 @@
           <w:color w:val="1E3A8A"/>
           <w:sz w:val="28"/>
         </w:rPr>
-        <w:t>5. Machine Learning Methodology</w:t>
+        <w:t>13. Conclusion</w:t>
       </w:r>
     </w:p>
     <w:p>
@@ -340,7 +1105,21 @@
           <w:rFonts w:ascii="Calibri" w:hAnsi="Calibri"/>
           <w:sz w:val="22"/>
         </w:rPr>
-        <w:t>A Scikit-Learn Pipeline was constructed consisting of:</w:t>
+        <w:t>This project demonstrates the full lifecycle of a business analytics solution: translating a strategic banking dilemma into an empirical machine learning pipeline and deploying an interactive decision tool. By calibrating Random Forest with balanced class weights, the system catches 71.7% of high-risk defaulters, balancing balance-sheet protection with customer acquisition margin.</w:t>
+      </w:r>
+    </w:p>
+    <w:p>
+      <w:pPr>
+        <w:spacing w:before="280" w:after="80"/>
+      </w:pPr>
+      <w:r>
+        <w:rPr>
+          <w:rFonts w:ascii="Calibri" w:hAnsi="Calibri"/>
+          <w:b/>
+          <w:color w:val="1E3A8A"/>
+          <w:sz w:val="28"/>
+        </w:rPr>
+        <w:t>14. Project Repository &amp; Deployment Links</w:t>
       </w:r>
     </w:p>
     <w:p>
@@ -354,14 +1133,14 @@
           <w:b/>
           <w:sz w:val="22"/>
         </w:rPr>
-        <w:t xml:space="preserve">Preprocessing: </w:t>
+        <w:t xml:space="preserve">GitHub Repository: </w:t>
       </w:r>
       <w:r>
         <w:rPr>
           <w:rFonts w:ascii="Calibri" w:hAnsi="Calibri"/>
           <w:sz w:val="22"/>
         </w:rPr>
-        <w:t>ColumnTransformer with StandardScaler for continuous attributes and OneHotEncoder for categorical variables.</w:t>
+        <w:t>https://github.com/Akshit226/streamlit-app-MLBA-02-</w:t>
       </w:r>
     </w:p>
     <w:p>
@@ -375,246 +1154,14 @@
           <w:b/>
           <w:sz w:val="22"/>
         </w:rPr>
-        <w:t xml:space="preserve">Algorithm: </w:t>
+        <w:t xml:space="preserve">Live Application URL: </w:t>
       </w:r>
       <w:r>
         <w:rPr>
           <w:rFonts w:ascii="Calibri" w:hAnsi="Calibri"/>
           <w:sz w:val="22"/>
         </w:rPr>
-        <w:t>RandomForestClassifier with 100 estimators, max_depth of 6, and class_weight=balanced to penalize minority default misclassifications.</w:t>
-      </w:r>
-    </w:p>
-    <w:p>
-      <w:pPr>
-        <w:pStyle w:val="ListBullet"/>
-        <w:spacing w:after="60" w:line="276" w:lineRule="auto"/>
-      </w:pPr>
-      <w:r>
-        <w:rPr>
-          <w:rFonts w:ascii="Calibri" w:hAnsi="Calibri"/>
-          <w:b/>
-          <w:sz w:val="22"/>
-        </w:rPr>
-        <w:t xml:space="preserve">Validation: </w:t>
-      </w:r>
-      <w:r>
-        <w:rPr>
-          <w:rFonts w:ascii="Calibri" w:hAnsi="Calibri"/>
-          <w:sz w:val="22"/>
-        </w:rPr>
-        <w:t>Stratified 80/20 train/test split maintaining the 70/30 class proportion.</w:t>
-      </w:r>
-    </w:p>
-    <w:p>
-      <w:pPr>
-        <w:spacing w:before="280" w:after="80"/>
-      </w:pPr>
-      <w:r>
-        <w:rPr>
-          <w:rFonts w:ascii="Calibri" w:hAnsi="Calibri"/>
-          <w:b/>
-          <w:color w:val="1E3A8A"/>
-          <w:sz w:val="28"/>
-        </w:rPr>
-        <w:t>6. Model Performance &amp; Confusion Matrix</w:t>
-      </w:r>
-    </w:p>
-    <w:p>
-      <w:pPr>
-        <w:spacing w:after="120" w:line="276" w:lineRule="auto"/>
-      </w:pPr>
-      <w:r>
-        <w:rPr>
-          <w:rFonts w:ascii="Calibri" w:hAnsi="Calibri"/>
-          <w:sz w:val="22"/>
-        </w:rPr>
-        <w:t>On the 200 unseen test applicants (140 Good, 60 Bad):</w:t>
-      </w:r>
-    </w:p>
-    <w:p>
-      <w:pPr>
-        <w:pStyle w:val="ListBullet"/>
-        <w:spacing w:after="60" w:line="276" w:lineRule="auto"/>
-      </w:pPr>
-      <w:r>
-        <w:rPr>
-          <w:rFonts w:ascii="Calibri" w:hAnsi="Calibri"/>
-          <w:b/>
-          <w:sz w:val="22"/>
-        </w:rPr>
-        <w:t xml:space="preserve">Accuracy: </w:t>
-      </w:r>
-      <w:r>
-        <w:rPr>
-          <w:rFonts w:ascii="Calibri" w:hAnsi="Calibri"/>
-          <w:sz w:val="22"/>
-        </w:rPr>
-        <w:t>70.0%</w:t>
-      </w:r>
-    </w:p>
-    <w:p>
-      <w:pPr>
-        <w:pStyle w:val="ListBullet"/>
-        <w:spacing w:after="60" w:line="276" w:lineRule="auto"/>
-      </w:pPr>
-      <w:r>
-        <w:rPr>
-          <w:rFonts w:ascii="Calibri" w:hAnsi="Calibri"/>
-          <w:b/>
-          <w:sz w:val="22"/>
-        </w:rPr>
-        <w:t xml:space="preserve">Recall (Defaulters): </w:t>
-      </w:r>
-      <w:r>
-        <w:rPr>
-          <w:rFonts w:ascii="Calibri" w:hAnsi="Calibri"/>
-          <w:sz w:val="22"/>
-        </w:rPr>
-        <w:t>71.7% (Successfully flagged 43 out of 60 actual defaulters)</w:t>
-      </w:r>
-    </w:p>
-    <w:p>
-      <w:pPr>
-        <w:pStyle w:val="ListBullet"/>
-        <w:spacing w:after="60" w:line="276" w:lineRule="auto"/>
-      </w:pPr>
-      <w:r>
-        <w:rPr>
-          <w:rFonts w:ascii="Calibri" w:hAnsi="Calibri"/>
-          <w:b/>
-          <w:sz w:val="22"/>
-        </w:rPr>
-        <w:t xml:space="preserve">Precision (Defaulters): </w:t>
-      </w:r>
-      <w:r>
-        <w:rPr>
-          <w:rFonts w:ascii="Calibri" w:hAnsi="Calibri"/>
-          <w:sz w:val="22"/>
-        </w:rPr>
-        <w:t>50.0% (43 True Positives, 43 False Positives)</w:t>
-      </w:r>
-    </w:p>
-    <w:p>
-      <w:pPr>
-        <w:pStyle w:val="ListBullet"/>
-        <w:spacing w:after="60" w:line="276" w:lineRule="auto"/>
-      </w:pPr>
-      <w:r>
-        <w:rPr>
-          <w:rFonts w:ascii="Calibri" w:hAnsi="Calibri"/>
-          <w:b/>
-          <w:sz w:val="22"/>
-        </w:rPr>
-        <w:t xml:space="preserve">F1-Score: </w:t>
-      </w:r>
-      <w:r>
-        <w:rPr>
-          <w:rFonts w:ascii="Calibri" w:hAnsi="Calibri"/>
-          <w:sz w:val="22"/>
-        </w:rPr>
-        <w:t>0.589</w:t>
-      </w:r>
-    </w:p>
-    <w:p>
-      <w:pPr>
-        <w:spacing w:after="120" w:line="276" w:lineRule="auto"/>
-      </w:pPr>
-      <w:r>
-        <w:rPr>
-          <w:rFonts w:ascii="Calibri" w:hAnsi="Calibri"/>
-          <w:sz w:val="22"/>
-        </w:rPr>
-        <w:t>Confusion Matrix breakdown: 97 True Negatives, 43 False Positives, 17 False Negatives, and 43 True Positives. Crucially, False Negatives were restricted to only 17 cases.</w:t>
-      </w:r>
-    </w:p>
-    <w:p>
-      <w:pPr>
-        <w:spacing w:before="280" w:after="80"/>
-      </w:pPr>
-      <w:r>
-        <w:rPr>
-          <w:rFonts w:ascii="Calibri" w:hAnsi="Calibri"/>
-          <w:b/>
-          <w:color w:val="1E3A8A"/>
-          <w:sz w:val="28"/>
-        </w:rPr>
-        <w:t>7. Interactive Streamlit Web Application &amp; Cloud Deployment</w:t>
-      </w:r>
-    </w:p>
-    <w:p>
-      <w:pPr>
-        <w:spacing w:after="120" w:line="276" w:lineRule="auto"/>
-      </w:pPr>
-      <w:r>
-        <w:rPr>
-          <w:rFonts w:ascii="Calibri" w:hAnsi="Calibri"/>
-          <w:sz w:val="22"/>
-        </w:rPr>
-        <w:t>The serialized pipeline (model.pkl) was integrated into a multi-page Streamlit web application (app.py):</w:t>
-      </w:r>
-    </w:p>
-    <w:p>
-      <w:pPr>
-        <w:pStyle w:val="ListBullet"/>
-        <w:spacing w:after="60" w:line="276" w:lineRule="auto"/>
-      </w:pPr>
-      <w:r>
-        <w:rPr>
-          <w:rFonts w:ascii="Calibri" w:hAnsi="Calibri"/>
-          <w:b/>
-          <w:sz w:val="22"/>
-        </w:rPr>
-        <w:t xml:space="preserve">Page 1: </w:t>
-      </w:r>
-      <w:r>
-        <w:rPr>
-          <w:rFonts w:ascii="Calibri" w:hAnsi="Calibri"/>
-          <w:sz w:val="22"/>
-        </w:rPr>
-        <w:t>Business Problem context, asymmetric risk explanation, and dataset summary.</w:t>
-      </w:r>
-    </w:p>
-    <w:p>
-      <w:pPr>
-        <w:pStyle w:val="ListBullet"/>
-        <w:spacing w:after="60" w:line="276" w:lineRule="auto"/>
-      </w:pPr>
-      <w:r>
-        <w:rPr>
-          <w:rFonts w:ascii="Calibri" w:hAnsi="Calibri"/>
-          <w:b/>
-          <w:sz w:val="22"/>
-        </w:rPr>
-        <w:t xml:space="preserve">Page 2: </w:t>
-      </w:r>
-      <w:r>
-        <w:rPr>
-          <w:rFonts w:ascii="Calibri" w:hAnsi="Calibri"/>
-          <w:sz w:val="22"/>
-        </w:rPr>
-        <w:t>Data insights with graphical visualizations of checking status, duration, and credit amounts.</w:t>
-      </w:r>
-    </w:p>
-    <w:p>
-      <w:pPr>
-        <w:pStyle w:val="ListBullet"/>
-        <w:spacing w:after="60" w:line="276" w:lineRule="auto"/>
-      </w:pPr>
-      <w:r>
-        <w:rPr>
-          <w:rFonts w:ascii="Calibri" w:hAnsi="Calibri"/>
-          <w:b/>
-          <w:sz w:val="22"/>
-        </w:rPr>
-        <w:t xml:space="preserve">Page 3: </w:t>
-      </w:r>
-      <w:r>
-        <w:rPr>
-          <w:rFonts w:ascii="Calibri" w:hAnsi="Calibri"/>
-          <w:sz w:val="22"/>
-        </w:rPr>
-        <w:t>Live Credit Risk Predictor: interactive sliders/inputs returning risk probability and triaged underwriting decisions (Approve, Manual Review, Decline).</w:t>
+        <w:t>https://streamlit-app-mlba-02.streamlit.app</w:t>
       </w:r>
     </w:p>
     <w:sectPr>

</xml_diff>

<commit_message>
Add official Jain University cover page, logo, student names, USNs, and class FBA-03 across report, slides, and app
</commit_message>
<xml_diff>
--- a/MLBA_Assignment_2_Project_Report.docx
+++ b/MLBA_Assignment_2_Project_Report.docx
@@ -4,47 +4,370 @@
   <w:body>
     <w:p>
       <w:pPr>
-        <w:spacing w:before="0" w:after="80"/>
+        <w:spacing w:before="0" w:after="200"/>
+        <w:jc w:val="center"/>
+      </w:pPr>
+      <w:r>
+        <w:drawing>
+          <wp:inline xmlns:a="http://schemas.openxmlformats.org/drawingml/2006/main" xmlns:pic="http://schemas.openxmlformats.org/drawingml/2006/picture">
+            <wp:extent cx="3017520" cy="1491010"/>
+            <wp:docPr id="1" name="Picture 1"/>
+            <wp:cNvGraphicFramePr>
+              <a:graphicFrameLocks noChangeAspect="1"/>
+            </wp:cNvGraphicFramePr>
+            <a:graphic>
+              <a:graphicData uri="http://schemas.openxmlformats.org/drawingml/2006/picture">
+                <pic:pic>
+                  <pic:nvPicPr>
+                    <pic:cNvPr id="0" name="jain_university_logo.png"/>
+                    <pic:cNvPicPr/>
+                  </pic:nvPicPr>
+                  <pic:blipFill>
+                    <a:blip r:embed="rId9"/>
+                    <a:stretch>
+                      <a:fillRect/>
+                    </a:stretch>
+                  </pic:blipFill>
+                  <pic:spPr>
+                    <a:xfrm>
+                      <a:off x="0" y="0"/>
+                      <a:ext cx="3017520" cy="1491010"/>
+                    </a:xfrm>
+                    <a:prstGeom prst="rect"/>
+                  </pic:spPr>
+                </pic:pic>
+              </a:graphicData>
+            </a:graphic>
+          </wp:inline>
+        </w:drawing>
+      </w:r>
+    </w:p>
+    <w:p>
+      <w:pPr>
+        <w:spacing w:after="40"/>
+        <w:jc w:val="center"/>
       </w:pPr>
       <w:r>
         <w:rPr>
           <w:rFonts w:ascii="Calibri" w:hAnsi="Calibri"/>
           <w:b/>
           <w:color w:val="1E3A8A"/>
-          <w:sz w:val="48"/>
+          <w:sz w:val="28"/>
         </w:rPr>
-        <w:t>MLBA Assignment 2: Project Report</w:t>
+        <w:t>JAIN (DEEMED-TO-BE UNIVERSITY), BANGALORE</w:t>
+        <w:br/>
+      </w:r>
+      <w:r>
+        <w:rPr>
+          <w:rFonts w:ascii="Calibri" w:hAnsi="Calibri"/>
+          <w:b/>
+          <w:color w:val="D97706"/>
+          <w:sz w:val="26"/>
+        </w:rPr>
+        <w:t>CMS BUSINESS SCHOOL</w:t>
+        <w:br/>
+      </w:r>
+      <w:r>
+        <w:rPr>
+          <w:rFonts w:ascii="Calibri" w:hAnsi="Calibri"/>
+          <w:color w:val="64748B"/>
+          <w:sz w:val="22"/>
+        </w:rPr>
+        <w:t>Master of Business Administration (MBA) | Semester – III (2025–2027)</w:t>
+        <w:br/>
+      </w:r>
+      <w:r>
+        <w:rPr>
+          <w:rFonts w:ascii="Calibri" w:hAnsi="Calibri"/>
+          <w:b/>
+          <w:color w:val="1E3A8A"/>
+          <w:sz w:val="22"/>
+        </w:rPr>
+        <w:t>Class / Section: FBA-03</w:t>
       </w:r>
     </w:p>
     <w:p>
       <w:pPr>
-        <w:spacing w:after="240"/>
+        <w:spacing w:before="80" w:after="240"/>
+        <w:jc w:val="center"/>
+      </w:pPr>
+      <w:r>
+        <w:rPr>
+          <w:color w:val="D97706"/>
+        </w:rPr>
+        <w:t>━━━━━━━━━━━━━━━━━━━━━━━━━━━━━━━━━━━━━━━━━━━━━</w:t>
+      </w:r>
+    </w:p>
+    <w:p>
+      <w:pPr>
+        <w:spacing w:after="80"/>
+        <w:jc w:val="center"/>
+      </w:pPr>
+      <w:r>
+        <w:rPr>
+          <w:rFonts w:ascii="Calibri" w:hAnsi="Calibri"/>
+          <w:b/>
+          <w:color w:val="D97706"/>
+          <w:sz w:val="24"/>
+        </w:rPr>
+        <w:t>COURSE: MACHINE LEARNING FOR BUSINESS APPLICATIONS (MLBA)</w:t>
+        <w:br/>
+      </w:r>
+      <w:r>
+        <w:rPr>
+          <w:rFonts w:ascii="Calibri" w:hAnsi="Calibri"/>
+          <w:b/>
+          <w:color w:val="0F172A"/>
+          <w:sz w:val="26"/>
+        </w:rPr>
+        <w:t>CONTINUOUS INTERNAL ASSESSMENT / ASSIGNMENT – 2</w:t>
+        <w:br/>
+      </w:r>
+      <w:r>
+        <w:rPr>
+          <w:rFonts w:ascii="Calibri" w:hAnsi="Calibri"/>
+          <w:b/>
+          <w:color w:val="1E3A8A"/>
+          <w:sz w:val="32"/>
+        </w:rPr>
+        <w:t>“AI-Driven Credit Default Risk Analyzer:</w:t>
+        <w:br/>
+        <w:t>Decision Support System for Retail Loan Underwriting”</w:t>
+      </w:r>
+    </w:p>
+    <w:p>
+      <w:pPr>
+        <w:spacing w:after="320"/>
+        <w:jc w:val="center"/>
       </w:pPr>
       <w:r>
         <w:rPr>
           <w:rFonts w:ascii="Calibri" w:hAnsi="Calibri"/>
           <w:i/>
           <w:color w:val="64748B"/>
-          <w:sz w:val="28"/>
+          <w:sz w:val="22"/>
         </w:rPr>
-        <w:t>AI-Driven Credit Default Risk Analyzer: Decision Support System for Retail Underwriting</w:t>
+        <w:t>An End-to-End Machine Learning Pipeline Deployed via Streamlit Community Cloud</w:t>
       </w:r>
     </w:p>
     <w:p>
       <w:pPr>
-        <w:spacing w:after="360"/>
+        <w:spacing w:before="120" w:after="80"/>
       </w:pPr>
       <w:r>
         <w:rPr>
           <w:rFonts w:ascii="Calibri" w:hAnsi="Calibri"/>
-          <w:color w:val="475569"/>
+          <w:b/>
+          <w:color w:val="1E3A8A"/>
+          <w:sz w:val="22"/>
+        </w:rPr>
+        <w:t>SUBMITTED BY:</w:t>
+      </w:r>
+    </w:p>
+    <w:tbl>
+      <w:tblPr>
+        <w:tblW w:type="auto" w:w="0"/>
+        <w:jc w:val="center"/>
+        <w:tblLayout w:type="fixed"/>
+        <w:tblLook w:firstColumn="1" w:firstRow="1" w:lastColumn="0" w:lastRow="0" w:noHBand="0" w:noVBand="1" w:val="04A0"/>
+      </w:tblPr>
+      <w:tblGrid>
+        <w:gridCol w:w="3120"/>
+        <w:gridCol w:w="3120"/>
+        <w:gridCol w:w="3120"/>
+      </w:tblGrid>
+      <w:tr>
+        <w:tc>
+          <w:tcPr>
+            <w:tcW w:type="dxa" w:w="3600"/>
+            <w:shd w:fill="1E3A8A"/>
+          </w:tcPr>
+          <w:p>
+            <w:r>
+              <w:rPr>
+                <w:rFonts w:ascii="Calibri" w:hAnsi="Calibri"/>
+                <w:b/>
+                <w:color w:val="FFFFFF"/>
+                <w:sz w:val="20"/>
+              </w:rPr>
+              <w:t>Student Name</w:t>
+            </w:r>
+          </w:p>
+        </w:tc>
+        <w:tc>
+          <w:tcPr>
+            <w:tcW w:type="dxa" w:w="3312"/>
+            <w:shd w:fill="1E3A8A"/>
+          </w:tcPr>
+          <w:p>
+            <w:r>
+              <w:rPr>
+                <w:rFonts w:ascii="Calibri" w:hAnsi="Calibri"/>
+                <w:b/>
+                <w:color w:val="FFFFFF"/>
+                <w:sz w:val="20"/>
+              </w:rPr>
+              <w:t>University Seat Number (USN)</w:t>
+            </w:r>
+          </w:p>
+        </w:tc>
+        <w:tc>
+          <w:tcPr>
+            <w:tcW w:type="dxa" w:w="2160"/>
+            <w:shd w:fill="1E3A8A"/>
+          </w:tcPr>
+          <w:p>
+            <w:r>
+              <w:rPr>
+                <w:rFonts w:ascii="Calibri" w:hAnsi="Calibri"/>
+                <w:b/>
+                <w:color w:val="FFFFFF"/>
+                <w:sz w:val="20"/>
+              </w:rPr>
+              <w:t>Class / Section</w:t>
+            </w:r>
+          </w:p>
+        </w:tc>
+      </w:tr>
+      <w:tr>
+        <w:tc>
+          <w:tcPr>
+            <w:tcW w:type="dxa" w:w="3600"/>
+          </w:tcPr>
+          <w:p>
+            <w:r>
+              <w:rPr>
+                <w:rFonts w:ascii="Calibri" w:hAnsi="Calibri"/>
+                <w:b/>
+                <w:color w:val="0F172A"/>
+                <w:sz w:val="21"/>
+              </w:rPr>
+              <w:t>Akshit Singh</w:t>
+            </w:r>
+          </w:p>
+        </w:tc>
+        <w:tc>
+          <w:tcPr>
+            <w:tcW w:type="dxa" w:w="3312"/>
+          </w:tcPr>
+          <w:p>
+            <w:r>
+              <w:rPr>
+                <w:rFonts w:ascii="Calibri" w:hAnsi="Calibri"/>
+                <w:color w:val="0F172A"/>
+                <w:sz w:val="21"/>
+              </w:rPr>
+              <w:t>25MBAR0401</w:t>
+            </w:r>
+          </w:p>
+        </w:tc>
+        <w:tc>
+          <w:tcPr>
+            <w:tcW w:type="dxa" w:w="2160"/>
+          </w:tcPr>
+          <w:p>
+            <w:r>
+              <w:rPr>
+                <w:rFonts w:ascii="Calibri" w:hAnsi="Calibri"/>
+                <w:color w:val="0F172A"/>
+                <w:sz w:val="21"/>
+              </w:rPr>
+              <w:t>FBA-03</w:t>
+            </w:r>
+          </w:p>
+        </w:tc>
+      </w:tr>
+      <w:tr>
+        <w:tc>
+          <w:tcPr>
+            <w:tcW w:type="dxa" w:w="3600"/>
+          </w:tcPr>
+          <w:p>
+            <w:r>
+              <w:rPr>
+                <w:rFonts w:ascii="Calibri" w:hAnsi="Calibri"/>
+                <w:b/>
+                <w:color w:val="0F172A"/>
+                <w:sz w:val="21"/>
+              </w:rPr>
+              <w:t>Vinay Tiwari</w:t>
+            </w:r>
+          </w:p>
+        </w:tc>
+        <w:tc>
+          <w:tcPr>
+            <w:tcW w:type="dxa" w:w="3312"/>
+          </w:tcPr>
+          <w:p>
+            <w:r>
+              <w:rPr>
+                <w:rFonts w:ascii="Calibri" w:hAnsi="Calibri"/>
+                <w:color w:val="0F172A"/>
+                <w:sz w:val="21"/>
+              </w:rPr>
+              <w:t>25MBAR0247</w:t>
+            </w:r>
+          </w:p>
+        </w:tc>
+        <w:tc>
+          <w:tcPr>
+            <w:tcW w:type="dxa" w:w="2160"/>
+          </w:tcPr>
+          <w:p>
+            <w:r>
+              <w:rPr>
+                <w:rFonts w:ascii="Calibri" w:hAnsi="Calibri"/>
+                <w:color w:val="0F172A"/>
+                <w:sz w:val="21"/>
+              </w:rPr>
+              <w:t>FBA-03</w:t>
+            </w:r>
+          </w:p>
+        </w:tc>
+      </w:tr>
+    </w:tbl>
+    <w:p>
+      <w:pPr>
+        <w:spacing w:before="360" w:after="40"/>
+      </w:pPr>
+      <w:r>
+        <w:rPr>
+          <w:rFonts w:ascii="Calibri" w:hAnsi="Calibri"/>
+          <w:b/>
+          <w:color w:val="1E3A8A"/>
+          <w:sz w:val="22"/>
+        </w:rPr>
+        <w:t>SUBMITTED TO:</w:t>
+        <w:br/>
+      </w:r>
+      <w:r>
+        <w:rPr>
+          <w:rFonts w:ascii="Calibri" w:hAnsi="Calibri"/>
+          <w:color w:val="0F172A"/>
+          <w:sz w:val="21"/>
+        </w:rPr>
+        <w:t>Faculty of Management Studies / CMS Business School</w:t>
+        <w:br/>
+        <w:t>Jain (Deemed-to-be University), Bangalore</w:t>
+        <w:br/>
+        <w:t>Academic Submission Date: September 2026</w:t>
+        <w:br/>
+        <w:br/>
+      </w:r>
+      <w:r>
+        <w:rPr>
+          <w:rFonts w:ascii="Calibri" w:hAnsi="Calibri"/>
+          <w:color w:val="D97706"/>
           <w:sz w:val="20"/>
         </w:rPr>
-        <w:t>Course: Machine Learning for Business Applications (MLBA) | Program: MBA – Business Analytics</w:t>
+        <w:t>• Live Interactive Application: https://streamlit-app-mlba-02.streamlit.app</w:t>
         <w:br/>
-        <w:t>GitHub Repository: https://github.com/Akshit226/streamlit-app-MLBA-02-</w:t>
-        <w:br/>
-        <w:t>Live Application: https://streamlit-app-mlba-02.streamlit.app</w:t>
+        <w:t>• GitHub Project Repository: https://github.com/Akshit226/streamlit-app-MLBA-02-</w:t>
+      </w:r>
+    </w:p>
+    <w:p>
+      <w:r>
+        <w:br w:type="page"/>
       </w:r>
     </w:p>
     <w:p>
@@ -68,9 +391,10 @@
       <w:r>
         <w:rPr>
           <w:rFonts w:ascii="Calibri" w:hAnsi="Calibri"/>
+          <w:color w:val="0F172A"/>
           <w:sz w:val="22"/>
         </w:rPr>
-        <w:t>Retail and commercial lending constitutes the primary revenue generator for banking institutions, operating on net interest margins. However, lending involves intrinsic credit default risk. When borrowers fail to fulfill contractual debt service obligations, banks accumulate Non-Performing Assets (NPAs), which directly impair Tier-1 regulatory capital reserves. This project develops an end-to-end Machine Learning Decision Support System, titled "Apex Underwrite", deployed via Streamlit to empower loan underwriters with real-time risk stratification and prescriptive credit decisions.</w:t>
+        <w:t>Retail and commercial lending constitutes the primary revenue generator for banking institutions, operating on net interest margins. However, extending credit carries intrinsic default risk. When borrowers fail to fulfill contractual debt obligations, banks accumulate Non-Performing Assets (NPAs), which directly impair regulatory capital. This project develops an end-to-end Machine Learning Decision Support System, titled "Apex Underwrite", deployed via Streamlit to empower loan underwriters with real-time risk stratification and prescriptive credit decisions.</w:t>
       </w:r>
     </w:p>
     <w:p>
@@ -94,6 +418,7 @@
       <w:r>
         <w:rPr>
           <w:rFonts w:ascii="Calibri" w:hAnsi="Calibri"/>
+          <w:color w:val="0F172A"/>
           <w:sz w:val="22"/>
         </w:rPr>
         <w:t>Commercial credit underwriting presents an asymmetric cost matrix between false predictions:</w:t>
@@ -108,6 +433,7 @@
         <w:rPr>
           <w:rFonts w:ascii="Calibri" w:hAnsi="Calibri"/>
           <w:b/>
+          <w:color w:val="1E3A8A"/>
           <w:sz w:val="22"/>
         </w:rPr>
         <w:t xml:space="preserve">False Negative (Type II Error - Severe Capital Loss): </w:t>
@@ -115,9 +441,10 @@
       <w:r>
         <w:rPr>
           <w:rFonts w:ascii="Calibri" w:hAnsi="Calibri"/>
+          <w:color w:val="0F172A"/>
           <w:sz w:val="22"/>
         </w:rPr>
-        <w:t>Approving a loan to a borrower who defaults. The bank loses 100% of unrecovered principal plus collection and legal recovery costs ($5,000 to $10,000+ per occurrence).</w:t>
+        <w:t>Approving a loan to a borrower who defaults. The bank loses 100% of unrecovered principal plus collection and legal recovery expenses ($5,000 to $10,000+ per occurrence).</w:t>
       </w:r>
     </w:p>
     <w:p>
@@ -129,6 +456,7 @@
         <w:rPr>
           <w:rFonts w:ascii="Calibri" w:hAnsi="Calibri"/>
           <w:b/>
+          <w:color w:val="1E3A8A"/>
           <w:sz w:val="22"/>
         </w:rPr>
         <w:t xml:space="preserve">False Positive (Type I Error - Opportunity Cost): </w:t>
@@ -136,9 +464,10 @@
       <w:r>
         <w:rPr>
           <w:rFonts w:ascii="Calibri" w:hAnsi="Calibri"/>
+          <w:color w:val="0F172A"/>
           <w:sz w:val="22"/>
         </w:rPr>
-        <w:t>Rejecting a creditworthy borrower. The bank forfeits the net interest margin (e.g., 6% to 10%) and risks customer churn.</w:t>
+        <w:t>Rejecting a creditworthy borrower. The bank forfeits the net interest margin (e.g., 6% to 10%) and risks customer relationship friction.</w:t>
       </w:r>
     </w:p>
     <w:p>
@@ -148,9 +477,10 @@
       <w:r>
         <w:rPr>
           <w:rFonts w:ascii="Calibri" w:hAnsi="Calibri"/>
+          <w:color w:val="0F172A"/>
           <w:sz w:val="22"/>
         </w:rPr>
-        <w:t>Analytics Objective: Build a binary classification system calibrated to maximize Recall on Defaulters, catching high-risk applicants before funds are disbursed, while maintaining viable business approval rates.</w:t>
+        <w:t>Analytics Objective: Build a binary classification system calibrated to maximize Recall on Defaulters, catching high-risk applicants before funds are disbursed, while maintaining viable commercial approval rates.</w:t>
       </w:r>
     </w:p>
     <w:p>
@@ -174,6 +504,7 @@
       <w:r>
         <w:rPr>
           <w:rFonts w:ascii="Calibri" w:hAnsi="Calibri"/>
+          <w:color w:val="0F172A"/>
           <w:sz w:val="22"/>
         </w:rPr>
         <w:t>The project leverages the benchmark Statlog German Credit Dataset from the UCI Machine Learning Repository / OpenML:</w:t>
@@ -188,6 +519,7 @@
         <w:rPr>
           <w:rFonts w:ascii="Calibri" w:hAnsi="Calibri"/>
           <w:b/>
+          <w:color w:val="1E3A8A"/>
           <w:sz w:val="22"/>
         </w:rPr>
         <w:t xml:space="preserve">Dataset Size: </w:t>
@@ -195,6 +527,7 @@
       <w:r>
         <w:rPr>
           <w:rFonts w:ascii="Calibri" w:hAnsi="Calibri"/>
+          <w:color w:val="0F172A"/>
           <w:sz w:val="22"/>
         </w:rPr>
         <w:t>1,000 historical bank credit applicant records.</w:t>
@@ -209,6 +542,7 @@
         <w:rPr>
           <w:rFonts w:ascii="Calibri" w:hAnsi="Calibri"/>
           <w:b/>
+          <w:color w:val="1E3A8A"/>
           <w:sz w:val="22"/>
         </w:rPr>
         <w:t xml:space="preserve">Feature Dimensionality: </w:t>
@@ -216,6 +550,7 @@
       <w:r>
         <w:rPr>
           <w:rFonts w:ascii="Calibri" w:hAnsi="Calibri"/>
+          <w:color w:val="0F172A"/>
           <w:sz w:val="22"/>
         </w:rPr>
         <w:t>20 original attributes encompassing financial liquidity, credit history, loan terms, and demographic indicators.</w:t>
@@ -230,6 +565,7 @@
         <w:rPr>
           <w:rFonts w:ascii="Calibri" w:hAnsi="Calibri"/>
           <w:b/>
+          <w:color w:val="1E3A8A"/>
           <w:sz w:val="22"/>
         </w:rPr>
         <w:t xml:space="preserve">Target Variable: </w:t>
@@ -237,6 +573,7 @@
       <w:r>
         <w:rPr>
           <w:rFonts w:ascii="Calibri" w:hAnsi="Calibri"/>
+          <w:color w:val="0F172A"/>
           <w:sz w:val="22"/>
         </w:rPr>
         <w:t>class — 700 Good repayers (70.0%, encoded as 0) and 300 Bad defaulters (30.0%, encoded as 1).</w:t>
@@ -251,6 +588,7 @@
         <w:rPr>
           <w:rFonts w:ascii="Calibri" w:hAnsi="Calibri"/>
           <w:b/>
+          <w:color w:val="1E3A8A"/>
           <w:sz w:val="22"/>
         </w:rPr>
         <w:t xml:space="preserve">Selected Features: </w:t>
@@ -258,6 +596,7 @@
       <w:r>
         <w:rPr>
           <w:rFonts w:ascii="Calibri" w:hAnsi="Calibri"/>
+          <w:color w:val="0F172A"/>
           <w:sz w:val="22"/>
         </w:rPr>
         <w:t>8 high-signal, operationally verifiable predictors: checking_status, duration, credit_amount, savings_status, employment, age, housing, and purpose.</w:t>
@@ -284,6 +623,7 @@
       <w:r>
         <w:rPr>
           <w:rFonts w:ascii="Calibri" w:hAnsi="Calibri"/>
+          <w:color w:val="0F172A"/>
           <w:sz w:val="22"/>
         </w:rPr>
         <w:t>Raw data was ingested and preprocessed using a leak-free Scikit-Learn ColumnTransformer pipeline:</w:t>
@@ -298,6 +638,7 @@
         <w:rPr>
           <w:rFonts w:ascii="Calibri" w:hAnsi="Calibri"/>
           <w:b/>
+          <w:color w:val="1E3A8A"/>
           <w:sz w:val="22"/>
         </w:rPr>
         <w:t xml:space="preserve">Handling Class Imbalance: </w:t>
@@ -305,6 +646,7 @@
       <w:r>
         <w:rPr>
           <w:rFonts w:ascii="Calibri" w:hAnsi="Calibri"/>
+          <w:color w:val="0F172A"/>
           <w:sz w:val="22"/>
         </w:rPr>
         <w:t>Class distribution shows a 70/30 split. Stratified sampling was applied during train/test partitioning to preserve identical class ratios.</w:t>
@@ -319,6 +661,7 @@
         <w:rPr>
           <w:rFonts w:ascii="Calibri" w:hAnsi="Calibri"/>
           <w:b/>
+          <w:color w:val="1E3A8A"/>
           <w:sz w:val="22"/>
         </w:rPr>
         <w:t xml:space="preserve">Continuous Feature Scaling: </w:t>
@@ -326,6 +669,7 @@
       <w:r>
         <w:rPr>
           <w:rFonts w:ascii="Calibri" w:hAnsi="Calibri"/>
+          <w:color w:val="0F172A"/>
           <w:sz w:val="22"/>
         </w:rPr>
         <w:t>duration, credit_amount, and age were scaled via StandardScaler to prevent large numerical ranges from dominating gradient updates.</w:t>
@@ -340,6 +684,7 @@
         <w:rPr>
           <w:rFonts w:ascii="Calibri" w:hAnsi="Calibri"/>
           <w:b/>
+          <w:color w:val="1E3A8A"/>
           <w:sz w:val="22"/>
         </w:rPr>
         <w:t xml:space="preserve">Categorical Encoding: </w:t>
@@ -347,6 +692,7 @@
       <w:r>
         <w:rPr>
           <w:rFonts w:ascii="Calibri" w:hAnsi="Calibri"/>
+          <w:color w:val="0F172A"/>
           <w:sz w:val="22"/>
         </w:rPr>
         <w:t>Categorical features (checking status, savings status, employment, housing, purpose) were transformed via OneHotEncoder with handle_unknown="ignore" to ensure production robustness.</w:t>
@@ -361,6 +707,7 @@
         <w:rPr>
           <w:rFonts w:ascii="Calibri" w:hAnsi="Calibri"/>
           <w:b/>
+          <w:color w:val="1E3A8A"/>
           <w:sz w:val="22"/>
         </w:rPr>
         <w:t xml:space="preserve">Validation Split: </w:t>
@@ -368,6 +715,7 @@
       <w:r>
         <w:rPr>
           <w:rFonts w:ascii="Calibri" w:hAnsi="Calibri"/>
+          <w:color w:val="0F172A"/>
           <w:sz w:val="22"/>
         </w:rPr>
         <w:t>An 80/20 stratified split partitioned 800 training applicants and 200 holdout test records.</w:t>
@@ -394,6 +742,7 @@
       <w:r>
         <w:rPr>
           <w:rFonts w:ascii="Calibri" w:hAnsi="Calibri"/>
+          <w:color w:val="0F172A"/>
           <w:sz w:val="22"/>
         </w:rPr>
         <w:t>Empirical analysis of historical data revealed three primary solvency signals:</w:t>
@@ -408,6 +757,7 @@
         <w:rPr>
           <w:rFonts w:ascii="Calibri" w:hAnsi="Calibri"/>
           <w:b/>
+          <w:color w:val="1E3A8A"/>
           <w:sz w:val="22"/>
         </w:rPr>
         <w:t xml:space="preserve">Signal 1: Checking Account Liquidity (#1 Risk Factor): </w:t>
@@ -415,6 +765,7 @@
       <w:r>
         <w:rPr>
           <w:rFonts w:ascii="Calibri" w:hAnsi="Calibri"/>
+          <w:color w:val="0F172A"/>
           <w:sz w:val="22"/>
         </w:rPr>
         <w:t>Applicants with negative or overdrawn checking balances (&lt; 0 DM) experienced default rates approaching 49.3%, whereas applicants maintaining &gt;= 200 DM defaulted at under 14.5%.</w:t>
@@ -429,6 +780,7 @@
         <w:rPr>
           <w:rFonts w:ascii="Calibri" w:hAnsi="Calibri"/>
           <w:b/>
+          <w:color w:val="1E3A8A"/>
           <w:sz w:val="22"/>
         </w:rPr>
         <w:t xml:space="preserve">Signal 2: Amortization Horizon: </w:t>
@@ -436,6 +788,7 @@
       <w:r>
         <w:rPr>
           <w:rFonts w:ascii="Calibri" w:hAnsi="Calibri"/>
+          <w:color w:val="0F172A"/>
           <w:sz w:val="22"/>
         </w:rPr>
         <w:t>Median loan duration for defaulters was 30 months compared to 18 months for repayers. Extended tenure compounds exposure to life shocks (unemployment, illness).</w:t>
@@ -450,6 +803,7 @@
         <w:rPr>
           <w:rFonts w:ascii="Calibri" w:hAnsi="Calibri"/>
           <w:b/>
+          <w:color w:val="1E3A8A"/>
           <w:sz w:val="22"/>
         </w:rPr>
         <w:t xml:space="preserve">Signal 3: Savings Buffer Resilience: </w:t>
@@ -457,6 +811,7 @@
       <w:r>
         <w:rPr>
           <w:rFonts w:ascii="Calibri" w:hAnsi="Calibri"/>
+          <w:color w:val="0F172A"/>
           <w:sz w:val="22"/>
         </w:rPr>
         <w:t>Applicants with savings &gt;= 1,000 DM maintained robust repayment even when requesting large credit amounts.</w:t>
@@ -483,6 +838,7 @@
       <w:r>
         <w:rPr>
           <w:rFonts w:ascii="Calibri" w:hAnsi="Calibri"/>
+          <w:color w:val="0F172A"/>
           <w:sz w:val="22"/>
         </w:rPr>
         <w:t>We evaluated multiple classifiers and selected Random Forest Classifier (n_estimators=100, max_depth=6) as the production estimator for several core reasons:</w:t>
@@ -497,6 +853,7 @@
         <w:rPr>
           <w:rFonts w:ascii="Calibri" w:hAnsi="Calibri"/>
           <w:b/>
+          <w:color w:val="1E3A8A"/>
           <w:sz w:val="22"/>
         </w:rPr>
         <w:t xml:space="preserve">Non-Linearity &amp; Interactions: </w:t>
@@ -504,6 +861,7 @@
       <w:r>
         <w:rPr>
           <w:rFonts w:ascii="Calibri" w:hAnsi="Calibri"/>
+          <w:color w:val="0F172A"/>
           <w:sz w:val="22"/>
         </w:rPr>
         <w:t>Credit risk involves complex multi-way interactions (e.g., high loan amount coupled with low savings). Tree ensembles naturally capture non-linear relationships without manual feature polynomialization.</w:t>
@@ -518,6 +876,7 @@
         <w:rPr>
           <w:rFonts w:ascii="Calibri" w:hAnsi="Calibri"/>
           <w:b/>
+          <w:color w:val="1E3A8A"/>
           <w:sz w:val="22"/>
         </w:rPr>
         <w:t xml:space="preserve">Robustness to Outliers: </w:t>
@@ -525,6 +884,7 @@
       <w:r>
         <w:rPr>
           <w:rFonts w:ascii="Calibri" w:hAnsi="Calibri"/>
+          <w:color w:val="0F172A"/>
           <w:sz w:val="22"/>
         </w:rPr>
         <w:t>Tree partitioning is invariant to monotonic transformations, preventing extreme loan amounts from skewing decision boundaries.</w:t>
@@ -539,6 +899,7 @@
         <w:rPr>
           <w:rFonts w:ascii="Calibri" w:hAnsi="Calibri"/>
           <w:b/>
+          <w:color w:val="1E3A8A"/>
           <w:sz w:val="22"/>
         </w:rPr>
         <w:t xml:space="preserve">Balanced Class Weighting: </w:t>
@@ -546,6 +907,7 @@
       <w:r>
         <w:rPr>
           <w:rFonts w:ascii="Calibri" w:hAnsi="Calibri"/>
+          <w:color w:val="0F172A"/>
           <w:sz w:val="22"/>
         </w:rPr>
         <w:t>Configured with class_weight="balanced", assigning dynamic loss penalties (w_bad ≈ 1.67 vs w_good ≈ 0.71). This penalizes misclassified defaulters 2.35x more heavily than false alarms.</w:t>
@@ -572,6 +934,7 @@
       <w:r>
         <w:rPr>
           <w:rFonts w:ascii="Calibri" w:hAnsi="Calibri"/>
+          <w:color w:val="0F172A"/>
           <w:sz w:val="22"/>
         </w:rPr>
         <w:t>The model was evaluated on the 200 unseen holdout applicants (140 Good, 60 Bad):</w:t>
@@ -586,6 +949,7 @@
         <w:rPr>
           <w:rFonts w:ascii="Calibri" w:hAnsi="Calibri"/>
           <w:b/>
+          <w:color w:val="1E3A8A"/>
           <w:sz w:val="22"/>
         </w:rPr>
         <w:t xml:space="preserve">Defaulter Recall (Primary KPI): </w:t>
@@ -593,6 +957,7 @@
       <w:r>
         <w:rPr>
           <w:rFonts w:ascii="Calibri" w:hAnsi="Calibri"/>
+          <w:color w:val="0F172A"/>
           <w:sz w:val="22"/>
         </w:rPr>
         <w:t>71.7% (Successfully flagged 43 out of 60 actual defaulters).</w:t>
@@ -607,6 +972,7 @@
         <w:rPr>
           <w:rFonts w:ascii="Calibri" w:hAnsi="Calibri"/>
           <w:b/>
+          <w:color w:val="1E3A8A"/>
           <w:sz w:val="22"/>
         </w:rPr>
         <w:t xml:space="preserve">Overall Accuracy: </w:t>
@@ -614,6 +980,7 @@
       <w:r>
         <w:rPr>
           <w:rFonts w:ascii="Calibri" w:hAnsi="Calibri"/>
+          <w:color w:val="0F172A"/>
           <w:sz w:val="22"/>
         </w:rPr>
         <w:t>70.0% (140 correct classifications out of 200).</w:t>
@@ -628,6 +995,7 @@
         <w:rPr>
           <w:rFonts w:ascii="Calibri" w:hAnsi="Calibri"/>
           <w:b/>
+          <w:color w:val="1E3A8A"/>
           <w:sz w:val="22"/>
         </w:rPr>
         <w:t xml:space="preserve">Defaulter Precision: </w:t>
@@ -635,6 +1003,7 @@
       <w:r>
         <w:rPr>
           <w:rFonts w:ascii="Calibri" w:hAnsi="Calibri"/>
+          <w:color w:val="0F172A"/>
           <w:sz w:val="22"/>
         </w:rPr>
         <w:t>50.0% (43 True Positives vs. 43 False Positives).</w:t>
@@ -649,6 +1018,7 @@
         <w:rPr>
           <w:rFonts w:ascii="Calibri" w:hAnsi="Calibri"/>
           <w:b/>
+          <w:color w:val="1E3A8A"/>
           <w:sz w:val="22"/>
         </w:rPr>
         <w:t xml:space="preserve">F1-Score: </w:t>
@@ -656,6 +1026,7 @@
       <w:r>
         <w:rPr>
           <w:rFonts w:ascii="Calibri" w:hAnsi="Calibri"/>
+          <w:color w:val="0F172A"/>
           <w:sz w:val="22"/>
         </w:rPr>
         <w:t>0.589.</w:t>
@@ -670,6 +1041,7 @@
         <w:rPr>
           <w:rFonts w:ascii="Calibri" w:hAnsi="Calibri"/>
           <w:b/>
+          <w:color w:val="1E3A8A"/>
           <w:sz w:val="22"/>
         </w:rPr>
         <w:t xml:space="preserve">Confusion Matrix Breakdown: </w:t>
@@ -677,6 +1049,7 @@
       <w:r>
         <w:rPr>
           <w:rFonts w:ascii="Calibri" w:hAnsi="Calibri"/>
+          <w:color w:val="0F172A"/>
           <w:sz w:val="22"/>
         </w:rPr>
         <w:t>True Negatives: 97 | False Positives: 43 | False Negatives: 17 | True Positives: 43.</w:t>
@@ -689,6 +1062,7 @@
       <w:r>
         <w:rPr>
           <w:rFonts w:ascii="Calibri" w:hAnsi="Calibri"/>
+          <w:color w:val="0F172A"/>
           <w:sz w:val="22"/>
         </w:rPr>
         <w:t>Crucially, False Negatives were restricted to only 17 cases out of 60, successfully preventing over 71% of potential credit losses.</w:t>
@@ -715,6 +1089,7 @@
       <w:r>
         <w:rPr>
           <w:rFonts w:ascii="Calibri" w:hAnsi="Calibri"/>
+          <w:color w:val="0F172A"/>
           <w:sz w:val="22"/>
         </w:rPr>
         <w:t>The fitted pipeline was serialized into model.pkl via joblib and embedded within a modern 3-page Streamlit web platform:</w:t>
@@ -729,6 +1104,7 @@
         <w:rPr>
           <w:rFonts w:ascii="Calibri" w:hAnsi="Calibri"/>
           <w:b/>
+          <w:color w:val="1E3A8A"/>
           <w:sz w:val="22"/>
         </w:rPr>
         <w:t xml:space="preserve">Page 1: Executive Overview: </w:t>
@@ -736,6 +1112,7 @@
       <w:r>
         <w:rPr>
           <w:rFonts w:ascii="Calibri" w:hAnsi="Calibri"/>
+          <w:color w:val="0F172A"/>
           <w:sz w:val="22"/>
         </w:rPr>
         <w:t>Presents the business context, asymmetric cost rationale, and high-level KPI cards.</w:t>
@@ -750,6 +1127,7 @@
         <w:rPr>
           <w:rFonts w:ascii="Calibri" w:hAnsi="Calibri"/>
           <w:b/>
+          <w:color w:val="1E3A8A"/>
           <w:sz w:val="22"/>
         </w:rPr>
         <w:t xml:space="preserve">Page 2: Portfolio Analytics: </w:t>
@@ -757,6 +1135,7 @@
       <w:r>
         <w:rPr>
           <w:rFonts w:ascii="Calibri" w:hAnsi="Calibri"/>
+          <w:color w:val="0F172A"/>
           <w:sz w:val="22"/>
         </w:rPr>
         <w:t>Interactive data exploration visualizing checking account solvency curves, tenure boxplots, and class distributions.</w:t>
@@ -771,6 +1150,7 @@
         <w:rPr>
           <w:rFonts w:ascii="Calibri" w:hAnsi="Calibri"/>
           <w:b/>
+          <w:color w:val="1E3A8A"/>
           <w:sz w:val="22"/>
         </w:rPr>
         <w:t xml:space="preserve">Page 3: Underwriting Decision Engine: </w:t>
@@ -778,6 +1158,7 @@
       <w:r>
         <w:rPr>
           <w:rFonts w:ascii="Calibri" w:hAnsi="Calibri"/>
+          <w:color w:val="0F172A"/>
           <w:sz w:val="22"/>
         </w:rPr>
         <w:t>Point-of-sale portal where loan officers input borrower credentials and receive real-time probability scores and triaged directives.</w:t>
@@ -804,6 +1185,7 @@
       <w:r>
         <w:rPr>
           <w:rFonts w:ascii="Calibri" w:hAnsi="Calibri"/>
+          <w:color w:val="0F172A"/>
           <w:sz w:val="22"/>
         </w:rPr>
         <w:t>The application is version-controlled on GitHub and deployed on Streamlit Community Cloud:</w:t>
@@ -818,6 +1200,7 @@
         <w:rPr>
           <w:rFonts w:ascii="Calibri" w:hAnsi="Calibri"/>
           <w:b/>
+          <w:color w:val="1E3A8A"/>
           <w:sz w:val="22"/>
         </w:rPr>
         <w:t xml:space="preserve">CI/CD Integration: </w:t>
@@ -825,6 +1208,7 @@
       <w:r>
         <w:rPr>
           <w:rFonts w:ascii="Calibri" w:hAnsi="Calibri"/>
+          <w:color w:val="0F172A"/>
           <w:sz w:val="22"/>
         </w:rPr>
         <w:t>Any commit pushed to the main branch automatically triggers container rebuilding and zero-downtime redeployment.</w:t>
@@ -839,6 +1223,7 @@
         <w:rPr>
           <w:rFonts w:ascii="Calibri" w:hAnsi="Calibri"/>
           <w:b/>
+          <w:color w:val="1E3A8A"/>
           <w:sz w:val="22"/>
         </w:rPr>
         <w:t xml:space="preserve">Environment Reproducibility: </w:t>
@@ -846,9 +1231,10 @@
       <w:r>
         <w:rPr>
           <w:rFonts w:ascii="Calibri" w:hAnsi="Calibri"/>
+          <w:color w:val="0F172A"/>
           <w:sz w:val="22"/>
         </w:rPr>
-        <w:t>dependencies are locked via requirements.txt, ensuring identical execution across cloud runtime environments.</w:t>
+        <w:t>Dependencies are locked via requirements.txt, ensuring identical execution across cloud runtime environments.</w:t>
       </w:r>
     </w:p>
     <w:p>
@@ -874,6 +1260,7 @@
         <w:rPr>
           <w:rFonts w:ascii="Calibri" w:hAnsi="Calibri"/>
           <w:b/>
+          <w:color w:val="1E3A8A"/>
           <w:sz w:val="22"/>
         </w:rPr>
         <w:t xml:space="preserve">Insight 1: </w:t>
@@ -881,6 +1268,7 @@
       <w:r>
         <w:rPr>
           <w:rFonts w:ascii="Calibri" w:hAnsi="Calibri"/>
+          <w:color w:val="0F172A"/>
           <w:sz w:val="22"/>
         </w:rPr>
         <w:t>Liquid cash buffers (checking and savings) are far more predictive of short-term credit solvency than demographic age.</w:t>
@@ -895,6 +1283,7 @@
         <w:rPr>
           <w:rFonts w:ascii="Calibri" w:hAnsi="Calibri"/>
           <w:b/>
+          <w:color w:val="1E3A8A"/>
           <w:sz w:val="22"/>
         </w:rPr>
         <w:t xml:space="preserve">Insight 2: </w:t>
@@ -902,6 +1291,7 @@
       <w:r>
         <w:rPr>
           <w:rFonts w:ascii="Calibri" w:hAnsi="Calibri"/>
+          <w:color w:val="0F172A"/>
           <w:sz w:val="22"/>
         </w:rPr>
         <w:t>Loan tenure is a risk multiplier. Restricting loan horizons to under 24 months reduces default exposure substantially.</w:t>
@@ -916,6 +1306,7 @@
         <w:rPr>
           <w:rFonts w:ascii="Calibri" w:hAnsi="Calibri"/>
           <w:b/>
+          <w:color w:val="1E3A8A"/>
           <w:sz w:val="22"/>
         </w:rPr>
         <w:t xml:space="preserve">Insight 3: </w:t>
@@ -923,6 +1314,7 @@
       <w:r>
         <w:rPr>
           <w:rFonts w:ascii="Calibri" w:hAnsi="Calibri"/>
+          <w:color w:val="0F172A"/>
           <w:sz w:val="22"/>
         </w:rPr>
         <w:t>Threshold tuning enables banks to adapt to shifting macroeconomic cycles: tightening approval thresholds during recessions and expanding them during expansionary phases.</w:t>
@@ -951,6 +1343,7 @@
         <w:rPr>
           <w:rFonts w:ascii="Calibri" w:hAnsi="Calibri"/>
           <w:b/>
+          <w:color w:val="1E3A8A"/>
           <w:sz w:val="22"/>
         </w:rPr>
         <w:t xml:space="preserve">Sample Size: </w:t>
@@ -958,6 +1351,7 @@
       <w:r>
         <w:rPr>
           <w:rFonts w:ascii="Calibri" w:hAnsi="Calibri"/>
+          <w:color w:val="0F172A"/>
           <w:sz w:val="22"/>
         </w:rPr>
         <w:t>The model is trained on 1,000 historical records; commercial enterprise scorecards typically utilize millions of bureau records.</w:t>
@@ -972,6 +1366,7 @@
         <w:rPr>
           <w:rFonts w:ascii="Calibri" w:hAnsi="Calibri"/>
           <w:b/>
+          <w:color w:val="1E3A8A"/>
           <w:sz w:val="22"/>
         </w:rPr>
         <w:t xml:space="preserve">Macroeconomic Omission: </w:t>
@@ -979,6 +1374,7 @@
       <w:r>
         <w:rPr>
           <w:rFonts w:ascii="Calibri" w:hAnsi="Calibri"/>
+          <w:color w:val="0F172A"/>
           <w:sz w:val="22"/>
         </w:rPr>
         <w:t>The dataset lacks external macro factors (inflation rate, central bank prime lending rate, regional unemployment rates).</w:t>
@@ -993,6 +1389,7 @@
         <w:rPr>
           <w:rFonts w:ascii="Calibri" w:hAnsi="Calibri"/>
           <w:b/>
+          <w:color w:val="1E3A8A"/>
           <w:sz w:val="22"/>
         </w:rPr>
         <w:t xml:space="preserve">Temporal Drift: </w:t>
@@ -1000,6 +1397,7 @@
       <w:r>
         <w:rPr>
           <w:rFonts w:ascii="Calibri" w:hAnsi="Calibri"/>
+          <w:color w:val="0F172A"/>
           <w:sz w:val="22"/>
         </w:rPr>
         <w:t>Consumer repayment behaviors shift over time; the model requires quarterly performance re-validation.</w:t>
@@ -1028,6 +1426,7 @@
         <w:rPr>
           <w:rFonts w:ascii="Calibri" w:hAnsi="Calibri"/>
           <w:b/>
+          <w:color w:val="1E3A8A"/>
           <w:sz w:val="22"/>
         </w:rPr>
         <w:t xml:space="preserve">Human-in-the-Loop Framework: </w:t>
@@ -1035,6 +1434,7 @@
       <w:r>
         <w:rPr>
           <w:rFonts w:ascii="Calibri" w:hAnsi="Calibri"/>
+          <w:color w:val="0F172A"/>
           <w:sz w:val="22"/>
         </w:rPr>
         <w:t>Deploy as a decision-support tool rather than an autonomous decision-maker.</w:t>
@@ -1049,6 +1449,7 @@
         <w:rPr>
           <w:rFonts w:ascii="Calibri" w:hAnsi="Calibri"/>
           <w:b/>
+          <w:color w:val="1E3A8A"/>
           <w:sz w:val="22"/>
         </w:rPr>
         <w:t xml:space="preserve">Triaged Workflow: </w:t>
@@ -1056,6 +1457,7 @@
       <w:r>
         <w:rPr>
           <w:rFonts w:ascii="Calibri" w:hAnsi="Calibri"/>
+          <w:color w:val="0F172A"/>
           <w:sz w:val="22"/>
         </w:rPr>
         <w:t>Automate straight-through processing for Green Tier applicants (&lt;35% risk), while routing Yellow Tier applicants (35%-55%) to senior underwriters for co-signer or collateral verification.</w:t>
@@ -1070,6 +1472,7 @@
         <w:rPr>
           <w:rFonts w:ascii="Calibri" w:hAnsi="Calibri"/>
           <w:b/>
+          <w:color w:val="1E3A8A"/>
           <w:sz w:val="22"/>
         </w:rPr>
         <w:t xml:space="preserve">Dynamic Pricing: </w:t>
@@ -1077,6 +1480,7 @@
       <w:r>
         <w:rPr>
           <w:rFonts w:ascii="Calibri" w:hAnsi="Calibri"/>
+          <w:color w:val="0F172A"/>
           <w:sz w:val="22"/>
         </w:rPr>
         <w:t>Incorporate risk-based pricing, adding interest rate spreads (e.g., +200 bps) to borderline approvals to compensate for residual credit risk.</w:t>
@@ -1103,6 +1507,7 @@
       <w:r>
         <w:rPr>
           <w:rFonts w:ascii="Calibri" w:hAnsi="Calibri"/>
+          <w:color w:val="0F172A"/>
           <w:sz w:val="22"/>
         </w:rPr>
         <w:t>This project demonstrates the full lifecycle of a business analytics solution: translating a strategic banking dilemma into an empirical machine learning pipeline and deploying an interactive decision tool. By calibrating Random Forest with balanced class weights, the system catches 71.7% of high-risk defaulters, balancing balance-sheet protection with customer acquisition margin.</w:t>
@@ -1131,6 +1536,7 @@
         <w:rPr>
           <w:rFonts w:ascii="Calibri" w:hAnsi="Calibri"/>
           <w:b/>
+          <w:color w:val="1E3A8A"/>
           <w:sz w:val="22"/>
         </w:rPr>
         <w:t xml:space="preserve">GitHub Repository: </w:t>
@@ -1138,6 +1544,7 @@
       <w:r>
         <w:rPr>
           <w:rFonts w:ascii="Calibri" w:hAnsi="Calibri"/>
+          <w:color w:val="0F172A"/>
           <w:sz w:val="22"/>
         </w:rPr>
         <w:t>https://github.com/Akshit226/streamlit-app-MLBA-02-</w:t>
@@ -1152,6 +1559,7 @@
         <w:rPr>
           <w:rFonts w:ascii="Calibri" w:hAnsi="Calibri"/>
           <w:b/>
+          <w:color w:val="1E3A8A"/>
           <w:sz w:val="22"/>
         </w:rPr>
         <w:t xml:space="preserve">Live Application URL: </w:t>
@@ -1159,6 +1567,7 @@
       <w:r>
         <w:rPr>
           <w:rFonts w:ascii="Calibri" w:hAnsi="Calibri"/>
+          <w:color w:val="0F172A"/>
           <w:sz w:val="22"/>
         </w:rPr>
         <w:t>https://streamlit-app-mlba-02.streamlit.app</w:t>
@@ -1166,7 +1575,7 @@
     </w:p>
     <w:sectPr>
       <w:pgSz w:w="12240" w:h="15840"/>
-      <w:pgMar w:top="1440" w:right="1440" w:bottom="1440" w:left="1440" w:header="720" w:footer="720" w:gutter="0"/>
+      <w:pgMar w:top="1152" w:right="1440" w:bottom="1152" w:left="1440" w:header="720" w:footer="720" w:gutter="0"/>
       <w:cols w:space="720"/>
       <w:docGrid w:linePitch="360"/>
     </w:sectPr>

</xml_diff>

<commit_message>
Refine report styling: adjust Jain logo scale, use pure black academic typography (Times New Roman), and remove AI styling
</commit_message>
<xml_diff>
--- a/MLBA_Assignment_2_Project_Report.docx
+++ b/MLBA_Assignment_2_Project_Report.docx
@@ -4,13 +4,13 @@
   <w:body>
     <w:p>
       <w:pPr>
-        <w:spacing w:before="0" w:after="200"/>
+        <w:spacing w:before="0" w:after="280"/>
         <w:jc w:val="center"/>
       </w:pPr>
       <w:r>
         <w:drawing>
           <wp:inline xmlns:a="http://schemas.openxmlformats.org/drawingml/2006/main" xmlns:pic="http://schemas.openxmlformats.org/drawingml/2006/picture">
-            <wp:extent cx="3017520" cy="1491010"/>
+            <wp:extent cx="2011680" cy="994007"/>
             <wp:docPr id="1" name="Picture 1"/>
             <wp:cNvGraphicFramePr>
               <a:graphicFrameLocks noChangeAspect="1"/>
@@ -31,7 +31,7 @@
                   <pic:spPr>
                     <a:xfrm>
                       <a:off x="0" y="0"/>
-                      <a:ext cx="3017520" cy="1491010"/>
+                      <a:ext cx="2011680" cy="994007"/>
                     </a:xfrm>
                     <a:prstGeom prst="rect"/>
                   </pic:spPr>
@@ -49,28 +49,28 @@
       </w:pPr>
       <w:r>
         <w:rPr>
-          <w:rFonts w:ascii="Calibri" w:hAnsi="Calibri"/>
+          <w:rFonts w:ascii="Times New Roman" w:hAnsi="Times New Roman"/>
           <w:b/>
-          <w:color w:val="1E3A8A"/>
-          <w:sz w:val="28"/>
+          <w:color w:val="000000"/>
+          <w:sz w:val="26"/>
         </w:rPr>
         <w:t>JAIN (DEEMED-TO-BE UNIVERSITY), BANGALORE</w:t>
         <w:br/>
       </w:r>
       <w:r>
         <w:rPr>
-          <w:rFonts w:ascii="Calibri" w:hAnsi="Calibri"/>
+          <w:rFonts w:ascii="Times New Roman" w:hAnsi="Times New Roman"/>
           <w:b/>
-          <w:color w:val="D97706"/>
-          <w:sz w:val="26"/>
+          <w:color w:val="000000"/>
+          <w:sz w:val="24"/>
         </w:rPr>
         <w:t>CMS BUSINESS SCHOOL</w:t>
         <w:br/>
       </w:r>
       <w:r>
         <w:rPr>
-          <w:rFonts w:ascii="Calibri" w:hAnsi="Calibri"/>
-          <w:color w:val="64748B"/>
+          <w:rFonts w:ascii="Times New Roman" w:hAnsi="Times New Roman"/>
+          <w:color w:val="000000"/>
           <w:sz w:val="22"/>
         </w:rPr>
         <w:t>Master of Business Administration (MBA) | Semester – III (2025–2027)</w:t>
@@ -78,87 +78,73 @@
       </w:r>
       <w:r>
         <w:rPr>
-          <w:rFonts w:ascii="Calibri" w:hAnsi="Calibri"/>
+          <w:rFonts w:ascii="Times New Roman" w:hAnsi="Times New Roman"/>
           <w:b/>
-          <w:color w:val="1E3A8A"/>
+          <w:color w:val="000000"/>
           <w:sz w:val="22"/>
         </w:rPr>
-        <w:t>Class / Section: FBA-03</w:t>
+        <w:t>Class: FBA-03</w:t>
       </w:r>
     </w:p>
     <w:p>
       <w:pPr>
-        <w:spacing w:before="80" w:after="240"/>
+        <w:spacing w:before="240" w:after="160"/>
+      </w:pPr>
+    </w:p>
+    <w:p>
+      <w:pPr>
+        <w:spacing w:after="120"/>
         <w:jc w:val="center"/>
       </w:pPr>
       <w:r>
         <w:rPr>
-          <w:color w:val="D97706"/>
+          <w:rFonts w:ascii="Times New Roman" w:hAnsi="Times New Roman"/>
+          <w:b/>
+          <w:color w:val="000000"/>
+          <w:sz w:val="23"/>
         </w:rPr>
-        <w:t>━━━━━━━━━━━━━━━━━━━━━━━━━━━━━━━━━━━━━━━━━━━━━</w:t>
+        <w:t>Course: Machine Learning for Business Applications (MLBA)</w:t>
+        <w:br/>
+        <w:t>Assignment – 2: Business Analytics Model &amp; Decision Tool</w:t>
+        <w:br/>
+        <w:br/>
+      </w:r>
+      <w:r>
+        <w:rPr>
+          <w:rFonts w:ascii="Times New Roman" w:hAnsi="Times New Roman"/>
+          <w:b/>
+          <w:color w:val="000000"/>
+          <w:sz w:val="28"/>
+        </w:rPr>
+        <w:t>AI-DRIVEN CREDIT DEFAULT RISK ANALYZER:</w:t>
+        <w:br/>
+        <w:t>DECISION SUPPORT SYSTEM FOR RETAIL LOAN UNDERWRITING</w:t>
       </w:r>
     </w:p>
     <w:p>
       <w:pPr>
-        <w:spacing w:after="80"/>
+        <w:spacing w:after="560"/>
         <w:jc w:val="center"/>
       </w:pPr>
       <w:r>
         <w:rPr>
-          <w:rFonts w:ascii="Calibri" w:hAnsi="Calibri"/>
-          <w:b/>
-          <w:color w:val="D97706"/>
-          <w:sz w:val="24"/>
+          <w:rFonts w:ascii="Times New Roman" w:hAnsi="Times New Roman"/>
+          <w:i/>
+          <w:color w:val="000000"/>
+          <w:sz w:val="22"/>
         </w:rPr>
-        <w:t>COURSE: MACHINE LEARNING FOR BUSINESS APPLICATIONS (MLBA)</w:t>
-        <w:br/>
-      </w:r>
-      <w:r>
-        <w:rPr>
-          <w:rFonts w:ascii="Calibri" w:hAnsi="Calibri"/>
-          <w:b/>
-          <w:color w:val="0F172A"/>
-          <w:sz w:val="26"/>
-        </w:rPr>
-        <w:t>CONTINUOUS INTERNAL ASSESSMENT / ASSIGNMENT – 2</w:t>
-        <w:br/>
-      </w:r>
-      <w:r>
-        <w:rPr>
-          <w:rFonts w:ascii="Calibri" w:hAnsi="Calibri"/>
-          <w:b/>
-          <w:color w:val="1E3A8A"/>
-          <w:sz w:val="32"/>
-        </w:rPr>
-        <w:t>“AI-Driven Credit Default Risk Analyzer:</w:t>
-        <w:br/>
-        <w:t>Decision Support System for Retail Loan Underwriting”</w:t>
+        <w:t>An End-to-End Supervised Classification Model and Interactive Web Application Deployed for Credit Risk Assessment</w:t>
       </w:r>
     </w:p>
     <w:p>
       <w:pPr>
-        <w:spacing w:after="320"/>
-        <w:jc w:val="center"/>
+        <w:spacing w:before="200" w:after="80"/>
       </w:pPr>
       <w:r>
         <w:rPr>
-          <w:rFonts w:ascii="Calibri" w:hAnsi="Calibri"/>
-          <w:i/>
-          <w:color w:val="64748B"/>
-          <w:sz w:val="22"/>
-        </w:rPr>
-        <w:t>An End-to-End Machine Learning Pipeline Deployed via Streamlit Community Cloud</w:t>
-      </w:r>
-    </w:p>
-    <w:p>
-      <w:pPr>
-        <w:spacing w:before="120" w:after="80"/>
-      </w:pPr>
-      <w:r>
-        <w:rPr>
-          <w:rFonts w:ascii="Calibri" w:hAnsi="Calibri"/>
+          <w:rFonts w:ascii="Times New Roman" w:hAnsi="Times New Roman"/>
           <w:b/>
-          <w:color w:val="1E3A8A"/>
+          <w:color w:val="000000"/>
           <w:sz w:val="22"/>
         </w:rPr>
         <w:t>SUBMITTED BY:</w:t>
@@ -180,15 +166,20 @@
         <w:tc>
           <w:tcPr>
             <w:tcW w:type="dxa" w:w="3600"/>
-            <w:shd w:fill="1E3A8A"/>
+            <w:tcBorders>
+              <w:top w:val="single" w:sz="4" w:space="0" w:color="000000"/>
+              <w:left w:val="none"/>
+              <w:bottom w:val="single" w:sz="4" w:space="0" w:color="000000"/>
+              <w:right w:val="none"/>
+            </w:tcBorders>
           </w:tcPr>
           <w:p>
             <w:r>
               <w:rPr>
-                <w:rFonts w:ascii="Calibri" w:hAnsi="Calibri"/>
+                <w:rFonts w:ascii="Times New Roman" w:hAnsi="Times New Roman"/>
                 <w:b/>
-                <w:color w:val="FFFFFF"/>
-                <w:sz w:val="20"/>
+                <w:color w:val="000000"/>
+                <w:sz w:val="21"/>
               </w:rPr>
               <w:t>Student Name</w:t>
             </w:r>
@@ -196,16 +187,21 @@
         </w:tc>
         <w:tc>
           <w:tcPr>
-            <w:tcW w:type="dxa" w:w="3312"/>
-            <w:shd w:fill="1E3A8A"/>
+            <w:tcW w:type="dxa" w:w="3456"/>
+            <w:tcBorders>
+              <w:top w:val="single" w:sz="4" w:space="0" w:color="000000"/>
+              <w:left w:val="none"/>
+              <w:bottom w:val="single" w:sz="4" w:space="0" w:color="000000"/>
+              <w:right w:val="none"/>
+            </w:tcBorders>
           </w:tcPr>
           <w:p>
             <w:r>
               <w:rPr>
-                <w:rFonts w:ascii="Calibri" w:hAnsi="Calibri"/>
+                <w:rFonts w:ascii="Times New Roman" w:hAnsi="Times New Roman"/>
                 <w:b/>
-                <w:color w:val="FFFFFF"/>
-                <w:sz w:val="20"/>
+                <w:color w:val="000000"/>
+                <w:sz w:val="21"/>
               </w:rPr>
               <w:t>University Seat Number (USN)</w:t>
             </w:r>
@@ -214,15 +210,20 @@
         <w:tc>
           <w:tcPr>
             <w:tcW w:type="dxa" w:w="2160"/>
-            <w:shd w:fill="1E3A8A"/>
+            <w:tcBorders>
+              <w:top w:val="single" w:sz="4" w:space="0" w:color="000000"/>
+              <w:left w:val="none"/>
+              <w:bottom w:val="single" w:sz="4" w:space="0" w:color="000000"/>
+              <w:right w:val="none"/>
+            </w:tcBorders>
           </w:tcPr>
           <w:p>
             <w:r>
               <w:rPr>
-                <w:rFonts w:ascii="Calibri" w:hAnsi="Calibri"/>
+                <w:rFonts w:ascii="Times New Roman" w:hAnsi="Times New Roman"/>
                 <w:b/>
-                <w:color w:val="FFFFFF"/>
-                <w:sz w:val="20"/>
+                <w:color w:val="000000"/>
+                <w:sz w:val="21"/>
               </w:rPr>
               <w:t>Class / Section</w:t>
             </w:r>
@@ -233,13 +234,18 @@
         <w:tc>
           <w:tcPr>
             <w:tcW w:type="dxa" w:w="3600"/>
+            <w:tcBorders>
+              <w:top w:val="none" w:sz="4" w:space="0" w:color="000000"/>
+              <w:left w:val="none"/>
+              <w:bottom w:val="none" w:sz="4" w:space="0" w:color="000000"/>
+              <w:right w:val="none"/>
+            </w:tcBorders>
           </w:tcPr>
           <w:p>
             <w:r>
               <w:rPr>
-                <w:rFonts w:ascii="Calibri" w:hAnsi="Calibri"/>
-                <w:b/>
-                <w:color w:val="0F172A"/>
+                <w:rFonts w:ascii="Times New Roman" w:hAnsi="Times New Roman"/>
+                <w:color w:val="000000"/>
                 <w:sz w:val="21"/>
               </w:rPr>
               <w:t>Akshit Singh</w:t>
@@ -248,13 +254,19 @@
         </w:tc>
         <w:tc>
           <w:tcPr>
-            <w:tcW w:type="dxa" w:w="3312"/>
+            <w:tcW w:type="dxa" w:w="3456"/>
+            <w:tcBorders>
+              <w:top w:val="none" w:sz="4" w:space="0" w:color="000000"/>
+              <w:left w:val="none"/>
+              <w:bottom w:val="none" w:sz="4" w:space="0" w:color="000000"/>
+              <w:right w:val="none"/>
+            </w:tcBorders>
           </w:tcPr>
           <w:p>
             <w:r>
               <w:rPr>
-                <w:rFonts w:ascii="Calibri" w:hAnsi="Calibri"/>
-                <w:color w:val="0F172A"/>
+                <w:rFonts w:ascii="Times New Roman" w:hAnsi="Times New Roman"/>
+                <w:color w:val="000000"/>
                 <w:sz w:val="21"/>
               </w:rPr>
               <w:t>25MBAR0401</w:t>
@@ -264,12 +276,18 @@
         <w:tc>
           <w:tcPr>
             <w:tcW w:type="dxa" w:w="2160"/>
+            <w:tcBorders>
+              <w:top w:val="none" w:sz="4" w:space="0" w:color="000000"/>
+              <w:left w:val="none"/>
+              <w:bottom w:val="none" w:sz="4" w:space="0" w:color="000000"/>
+              <w:right w:val="none"/>
+            </w:tcBorders>
           </w:tcPr>
           <w:p>
             <w:r>
               <w:rPr>
-                <w:rFonts w:ascii="Calibri" w:hAnsi="Calibri"/>
-                <w:color w:val="0F172A"/>
+                <w:rFonts w:ascii="Times New Roman" w:hAnsi="Times New Roman"/>
+                <w:color w:val="000000"/>
                 <w:sz w:val="21"/>
               </w:rPr>
               <w:t>FBA-03</w:t>
@@ -281,13 +299,18 @@
         <w:tc>
           <w:tcPr>
             <w:tcW w:type="dxa" w:w="3600"/>
+            <w:tcBorders>
+              <w:top w:val="none" w:sz="4" w:space="0" w:color="000000"/>
+              <w:left w:val="none"/>
+              <w:bottom w:val="single" w:sz="4" w:space="0" w:color="000000"/>
+              <w:right w:val="none"/>
+            </w:tcBorders>
           </w:tcPr>
           <w:p>
             <w:r>
               <w:rPr>
-                <w:rFonts w:ascii="Calibri" w:hAnsi="Calibri"/>
-                <w:b/>
-                <w:color w:val="0F172A"/>
+                <w:rFonts w:ascii="Times New Roman" w:hAnsi="Times New Roman"/>
+                <w:color w:val="000000"/>
                 <w:sz w:val="21"/>
               </w:rPr>
               <w:t>Vinay Tiwari</w:t>
@@ -296,13 +319,19 @@
         </w:tc>
         <w:tc>
           <w:tcPr>
-            <w:tcW w:type="dxa" w:w="3312"/>
+            <w:tcW w:type="dxa" w:w="3456"/>
+            <w:tcBorders>
+              <w:top w:val="none" w:sz="4" w:space="0" w:color="000000"/>
+              <w:left w:val="none"/>
+              <w:bottom w:val="single" w:sz="4" w:space="0" w:color="000000"/>
+              <w:right w:val="none"/>
+            </w:tcBorders>
           </w:tcPr>
           <w:p>
             <w:r>
               <w:rPr>
-                <w:rFonts w:ascii="Calibri" w:hAnsi="Calibri"/>
-                <w:color w:val="0F172A"/>
+                <w:rFonts w:ascii="Times New Roman" w:hAnsi="Times New Roman"/>
+                <w:color w:val="000000"/>
                 <w:sz w:val="21"/>
               </w:rPr>
               <w:t>25MBAR0247</w:t>
@@ -312,12 +341,18 @@
         <w:tc>
           <w:tcPr>
             <w:tcW w:type="dxa" w:w="2160"/>
+            <w:tcBorders>
+              <w:top w:val="none" w:sz="4" w:space="0" w:color="000000"/>
+              <w:left w:val="none"/>
+              <w:bottom w:val="single" w:sz="4" w:space="0" w:color="000000"/>
+              <w:right w:val="none"/>
+            </w:tcBorders>
           </w:tcPr>
           <w:p>
             <w:r>
               <w:rPr>
-                <w:rFonts w:ascii="Calibri" w:hAnsi="Calibri"/>
-                <w:color w:val="0F172A"/>
+                <w:rFonts w:ascii="Times New Roman" w:hAnsi="Times New Roman"/>
+                <w:color w:val="000000"/>
                 <w:sz w:val="21"/>
               </w:rPr>
               <w:t>FBA-03</w:t>
@@ -328,13 +363,13 @@
     </w:tbl>
     <w:p>
       <w:pPr>
-        <w:spacing w:before="360" w:after="40"/>
+        <w:spacing w:before="560" w:after="40"/>
       </w:pPr>
       <w:r>
         <w:rPr>
-          <w:rFonts w:ascii="Calibri" w:hAnsi="Calibri"/>
+          <w:rFonts w:ascii="Times New Roman" w:hAnsi="Times New Roman"/>
           <w:b/>
-          <w:color w:val="1E3A8A"/>
+          <w:color w:val="000000"/>
           <w:sz w:val="22"/>
         </w:rPr>
         <w:t>SUBMITTED TO:</w:t>
@@ -342,8 +377,8 @@
       </w:r>
       <w:r>
         <w:rPr>
-          <w:rFonts w:ascii="Calibri" w:hAnsi="Calibri"/>
-          <w:color w:val="0F172A"/>
+          <w:rFonts w:ascii="Times New Roman" w:hAnsi="Times New Roman"/>
+          <w:color w:val="000000"/>
           <w:sz w:val="21"/>
         </w:rPr>
         <w:t>Faculty of Management Studies / CMS Business School</w:t>
@@ -353,16 +388,11 @@
         <w:t>Academic Submission Date: September 2026</w:t>
         <w:br/>
         <w:br/>
-      </w:r>
-      <w:r>
-        <w:rPr>
-          <w:rFonts w:ascii="Calibri" w:hAnsi="Calibri"/>
-          <w:color w:val="D97706"/>
-          <w:sz w:val="20"/>
-        </w:rPr>
-        <w:t>• Live Interactive Application: https://streamlit-app-mlba-02.streamlit.app</w:t>
+        <w:t>Project Links:</w:t>
         <w:br/>
-        <w:t>• GitHub Project Repository: https://github.com/Akshit226/streamlit-app-MLBA-02-</w:t>
+        <w:t>• GitHub Repository: https://github.com/Akshit226/streamlit-app-MLBA-02-</w:t>
+        <w:br/>
+        <w:t>• Deployed Application: https://streamlit-app-mlba-02.streamlit.app</w:t>
       </w:r>
     </w:p>
     <w:p>
@@ -376,10 +406,10 @@
       </w:pPr>
       <w:r>
         <w:rPr>
-          <w:rFonts w:ascii="Calibri" w:hAnsi="Calibri"/>
+          <w:rFonts w:ascii="Times New Roman" w:hAnsi="Times New Roman"/>
           <w:b/>
-          <w:color w:val="1E3A8A"/>
-          <w:sz w:val="28"/>
+          <w:color w:val="000000"/>
+          <w:sz w:val="26"/>
         </w:rPr>
         <w:t>1. Introduction</w:t>
       </w:r>
@@ -390,11 +420,11 @@
       </w:pPr>
       <w:r>
         <w:rPr>
-          <w:rFonts w:ascii="Calibri" w:hAnsi="Calibri"/>
-          <w:color w:val="0F172A"/>
+          <w:rFonts w:ascii="Times New Roman" w:hAnsi="Times New Roman"/>
+          <w:color w:val="000000"/>
           <w:sz w:val="22"/>
         </w:rPr>
-        <w:t>Retail and commercial lending constitutes the primary revenue generator for banking institutions, operating on net interest margins. However, extending credit carries intrinsic default risk. When borrowers fail to fulfill contractual debt obligations, banks accumulate Non-Performing Assets (NPAs), which directly impair regulatory capital. This project develops an end-to-end Machine Learning Decision Support System, titled "Apex Underwrite", deployed via Streamlit to empower loan underwriters with real-time risk stratification and prescriptive credit decisions.</w:t>
+        <w:t>In retail and commercial banking, extending credit facilities forms the core driver of operating revenue. However, credit origination carries systemic credit risk. When borrowers fail to fulfill contractual repayment schedules, lending institutions incur credit default write-offs, culminating in Non-Performing Assets (NPAs). This project develops and deploys an interactive Machine Learning Decision Support System, titled "Apex Underwrite", engineered to assist loan underwriting officers in assessing default probabilities, segmenting risk exposure, and standardizing credit decisions through a live Streamlit application.</w:t>
       </w:r>
     </w:p>
     <w:p>
@@ -403,10 +433,10 @@
       </w:pPr>
       <w:r>
         <w:rPr>
-          <w:rFonts w:ascii="Calibri" w:hAnsi="Calibri"/>
+          <w:rFonts w:ascii="Times New Roman" w:hAnsi="Times New Roman"/>
           <w:b/>
-          <w:color w:val="1E3A8A"/>
-          <w:sz w:val="28"/>
+          <w:color w:val="000000"/>
+          <w:sz w:val="26"/>
         </w:rPr>
         <w:t>2. Business Problem &amp; The Asymmetric Cost of Errors</w:t>
       </w:r>
@@ -417,11 +447,11 @@
       </w:pPr>
       <w:r>
         <w:rPr>
-          <w:rFonts w:ascii="Calibri" w:hAnsi="Calibri"/>
-          <w:color w:val="0F172A"/>
+          <w:rFonts w:ascii="Times New Roman" w:hAnsi="Times New Roman"/>
+          <w:color w:val="000000"/>
           <w:sz w:val="22"/>
         </w:rPr>
-        <w:t>Commercial credit underwriting presents an asymmetric cost matrix between false predictions:</w:t>
+        <w:t>Commercial credit underwriting operates under a fundamentally asymmetric cost structure:</w:t>
       </w:r>
     </w:p>
     <w:p>
@@ -431,20 +461,20 @@
       </w:pPr>
       <w:r>
         <w:rPr>
-          <w:rFonts w:ascii="Calibri" w:hAnsi="Calibri"/>
+          <w:rFonts w:ascii="Times New Roman" w:hAnsi="Times New Roman"/>
           <w:b/>
-          <w:color w:val="1E3A8A"/>
+          <w:color w:val="000000"/>
           <w:sz w:val="22"/>
         </w:rPr>
-        <w:t xml:space="preserve">False Negative (Type II Error - Severe Capital Loss): </w:t>
+        <w:t xml:space="preserve">False Negative (Type II Error - Costly): </w:t>
       </w:r>
       <w:r>
         <w:rPr>
-          <w:rFonts w:ascii="Calibri" w:hAnsi="Calibri"/>
-          <w:color w:val="0F172A"/>
+          <w:rFonts w:ascii="Times New Roman" w:hAnsi="Times New Roman"/>
+          <w:color w:val="000000"/>
           <w:sz w:val="22"/>
         </w:rPr>
-        <w:t>Approving a loan to a borrower who defaults. The bank loses 100% of unrecovered principal plus collection and legal recovery expenses ($5,000 to $10,000+ per occurrence).</w:t>
+        <w:t>The model classifies an applicant as low-risk (Good), but the borrower subsequently defaults. The bank loses the principal loan balance plus recovery and legal costs ($5,000 to $10,000+ per occurrence).</w:t>
       </w:r>
     </w:p>
     <w:p>
@@ -454,20 +484,20 @@
       </w:pPr>
       <w:r>
         <w:rPr>
-          <w:rFonts w:ascii="Calibri" w:hAnsi="Calibri"/>
+          <w:rFonts w:ascii="Times New Roman" w:hAnsi="Times New Roman"/>
           <w:b/>
-          <w:color w:val="1E3A8A"/>
+          <w:color w:val="000000"/>
           <w:sz w:val="22"/>
         </w:rPr>
         <w:t xml:space="preserve">False Positive (Type I Error - Opportunity Cost): </w:t>
       </w:r>
       <w:r>
         <w:rPr>
-          <w:rFonts w:ascii="Calibri" w:hAnsi="Calibri"/>
-          <w:color w:val="0F172A"/>
+          <w:rFonts w:ascii="Times New Roman" w:hAnsi="Times New Roman"/>
+          <w:color w:val="000000"/>
           <w:sz w:val="22"/>
         </w:rPr>
-        <w:t>Rejecting a creditworthy borrower. The bank forfeits the net interest margin (e.g., 6% to 10%) and risks customer relationship friction.</w:t>
+        <w:t>The model flags a creditworthy borrower as high-risk (Bad). The bank loses the net interest margin (e.g., 6% to 10%) and risks client relationship friction.</w:t>
       </w:r>
     </w:p>
     <w:p>
@@ -476,11 +506,11 @@
       </w:pPr>
       <w:r>
         <w:rPr>
-          <w:rFonts w:ascii="Calibri" w:hAnsi="Calibri"/>
-          <w:color w:val="0F172A"/>
+          <w:rFonts w:ascii="Times New Roman" w:hAnsi="Times New Roman"/>
+          <w:color w:val="000000"/>
           <w:sz w:val="22"/>
         </w:rPr>
-        <w:t>Analytics Objective: Build a binary classification system calibrated to maximize Recall on Defaulters, catching high-risk applicants before funds are disbursed, while maintaining viable commercial approval rates.</w:t>
+        <w:t>Because credit losses directly impair bank balance sheets and regulatory capital, the primary analytical objective of this study is to maximize Recall on Defaulters while maintaining viable customer origination rates.</w:t>
       </w:r>
     </w:p>
     <w:p>
@@ -489,10 +519,10 @@
       </w:pPr>
       <w:r>
         <w:rPr>
-          <w:rFonts w:ascii="Calibri" w:hAnsi="Calibri"/>
+          <w:rFonts w:ascii="Times New Roman" w:hAnsi="Times New Roman"/>
           <w:b/>
-          <w:color w:val="1E3A8A"/>
-          <w:sz w:val="28"/>
+          <w:color w:val="000000"/>
+          <w:sz w:val="26"/>
         </w:rPr>
         <w:t>3. Dataset Description</w:t>
       </w:r>
@@ -503,11 +533,11 @@
       </w:pPr>
       <w:r>
         <w:rPr>
-          <w:rFonts w:ascii="Calibri" w:hAnsi="Calibri"/>
-          <w:color w:val="0F172A"/>
+          <w:rFonts w:ascii="Times New Roman" w:hAnsi="Times New Roman"/>
+          <w:color w:val="000000"/>
           <w:sz w:val="22"/>
         </w:rPr>
-        <w:t>The project leverages the benchmark Statlog German Credit Dataset from the UCI Machine Learning Repository / OpenML:</w:t>
+        <w:t>The study utilizes the benchmark Statlog German Credit Dataset from the UCI Machine Learning Repository / OpenML:</w:t>
       </w:r>
     </w:p>
     <w:p>
@@ -517,20 +547,20 @@
       </w:pPr>
       <w:r>
         <w:rPr>
-          <w:rFonts w:ascii="Calibri" w:hAnsi="Calibri"/>
+          <w:rFonts w:ascii="Times New Roman" w:hAnsi="Times New Roman"/>
           <w:b/>
-          <w:color w:val="1E3A8A"/>
+          <w:color w:val="000000"/>
           <w:sz w:val="22"/>
         </w:rPr>
-        <w:t xml:space="preserve">Dataset Size: </w:t>
+        <w:t xml:space="preserve">Dataset Scale: </w:t>
       </w:r>
       <w:r>
         <w:rPr>
-          <w:rFonts w:ascii="Calibri" w:hAnsi="Calibri"/>
-          <w:color w:val="0F172A"/>
+          <w:rFonts w:ascii="Times New Roman" w:hAnsi="Times New Roman"/>
+          <w:color w:val="000000"/>
           <w:sz w:val="22"/>
         </w:rPr>
-        <w:t>1,000 historical bank credit applicant records.</w:t>
+        <w:t>1,000 historic credit applicant records.</w:t>
       </w:r>
     </w:p>
     <w:p>
@@ -540,20 +570,20 @@
       </w:pPr>
       <w:r>
         <w:rPr>
-          <w:rFonts w:ascii="Calibri" w:hAnsi="Calibri"/>
+          <w:rFonts w:ascii="Times New Roman" w:hAnsi="Times New Roman"/>
           <w:b/>
-          <w:color w:val="1E3A8A"/>
+          <w:color w:val="000000"/>
           <w:sz w:val="22"/>
         </w:rPr>
-        <w:t xml:space="preserve">Feature Dimensionality: </w:t>
+        <w:t xml:space="preserve">Original Attributes: </w:t>
       </w:r>
       <w:r>
         <w:rPr>
-          <w:rFonts w:ascii="Calibri" w:hAnsi="Calibri"/>
-          <w:color w:val="0F172A"/>
+          <w:rFonts w:ascii="Times New Roman" w:hAnsi="Times New Roman"/>
+          <w:color w:val="000000"/>
           <w:sz w:val="22"/>
         </w:rPr>
-        <w:t>20 original attributes encompassing financial liquidity, credit history, loan terms, and demographic indicators.</w:t>
+        <w:t>20 predictor variables encompassing applicant financial status, banking history, loan characteristics, and personal demographics.</w:t>
       </w:r>
     </w:p>
     <w:p>
@@ -563,17 +593,17 @@
       </w:pPr>
       <w:r>
         <w:rPr>
-          <w:rFonts w:ascii="Calibri" w:hAnsi="Calibri"/>
+          <w:rFonts w:ascii="Times New Roman" w:hAnsi="Times New Roman"/>
           <w:b/>
-          <w:color w:val="1E3A8A"/>
+          <w:color w:val="000000"/>
           <w:sz w:val="22"/>
         </w:rPr>
         <w:t xml:space="preserve">Target Variable: </w:t>
       </w:r>
       <w:r>
         <w:rPr>
-          <w:rFonts w:ascii="Calibri" w:hAnsi="Calibri"/>
-          <w:color w:val="0F172A"/>
+          <w:rFonts w:ascii="Times New Roman" w:hAnsi="Times New Roman"/>
+          <w:color w:val="000000"/>
           <w:sz w:val="22"/>
         </w:rPr>
         <w:t>class — 700 Good repayers (70.0%, encoded as 0) and 300 Bad defaulters (30.0%, encoded as 1).</w:t>
@@ -586,20 +616,20 @@
       </w:pPr>
       <w:r>
         <w:rPr>
-          <w:rFonts w:ascii="Calibri" w:hAnsi="Calibri"/>
+          <w:rFonts w:ascii="Times New Roman" w:hAnsi="Times New Roman"/>
           <w:b/>
-          <w:color w:val="1E3A8A"/>
+          <w:color w:val="000000"/>
           <w:sz w:val="22"/>
         </w:rPr>
         <w:t xml:space="preserve">Selected Features: </w:t>
       </w:r>
       <w:r>
         <w:rPr>
-          <w:rFonts w:ascii="Calibri" w:hAnsi="Calibri"/>
-          <w:color w:val="0F172A"/>
+          <w:rFonts w:ascii="Times New Roman" w:hAnsi="Times New Roman"/>
+          <w:color w:val="000000"/>
           <w:sz w:val="22"/>
         </w:rPr>
-        <w:t>8 high-signal, operationally verifiable predictors: checking_status, duration, credit_amount, savings_status, employment, age, housing, and purpose.</w:t>
+        <w:t>8 key variables identified as operationally relevant for retail underwriting: checking_status, duration, credit_amount, savings_status, employment, age, housing, and purpose.</w:t>
       </w:r>
     </w:p>
     <w:p>
@@ -608,10 +638,10 @@
       </w:pPr>
       <w:r>
         <w:rPr>
-          <w:rFonts w:ascii="Calibri" w:hAnsi="Calibri"/>
+          <w:rFonts w:ascii="Times New Roman" w:hAnsi="Times New Roman"/>
           <w:b/>
-          <w:color w:val="1E3A8A"/>
-          <w:sz w:val="28"/>
+          <w:color w:val="000000"/>
+          <w:sz w:val="26"/>
         </w:rPr>
         <w:t>4. Data Preparation &amp; Cleaning</w:t>
       </w:r>
@@ -622,11 +652,11 @@
       </w:pPr>
       <w:r>
         <w:rPr>
-          <w:rFonts w:ascii="Calibri" w:hAnsi="Calibri"/>
-          <w:color w:val="0F172A"/>
+          <w:rFonts w:ascii="Times New Roman" w:hAnsi="Times New Roman"/>
+          <w:color w:val="000000"/>
           <w:sz w:val="22"/>
         </w:rPr>
-        <w:t>Raw data was ingested and preprocessed using a leak-free Scikit-Learn ColumnTransformer pipeline:</w:t>
+        <w:t>Data preprocessing was structured inside a Scikit-Learn ColumnTransformer pipeline to ensure strict data leakage prevention:</w:t>
       </w:r>
     </w:p>
     <w:p>
@@ -636,20 +666,20 @@
       </w:pPr>
       <w:r>
         <w:rPr>
-          <w:rFonts w:ascii="Calibri" w:hAnsi="Calibri"/>
+          <w:rFonts w:ascii="Times New Roman" w:hAnsi="Times New Roman"/>
           <w:b/>
-          <w:color w:val="1E3A8A"/>
+          <w:color w:val="000000"/>
           <w:sz w:val="22"/>
         </w:rPr>
         <w:t xml:space="preserve">Handling Class Imbalance: </w:t>
       </w:r>
       <w:r>
         <w:rPr>
-          <w:rFonts w:ascii="Calibri" w:hAnsi="Calibri"/>
-          <w:color w:val="0F172A"/>
+          <w:rFonts w:ascii="Times New Roman" w:hAnsi="Times New Roman"/>
+          <w:color w:val="000000"/>
           <w:sz w:val="22"/>
         </w:rPr>
-        <w:t>Class distribution shows a 70/30 split. Stratified sampling was applied during train/test partitioning to preserve identical class ratios.</w:t>
+        <w:t>The dataset reflects a 70/30 class distribution. Stratified train/test splitting was implemented to maintain exact class proportions across partitions.</w:t>
       </w:r>
     </w:p>
     <w:p>
@@ -659,20 +689,20 @@
       </w:pPr>
       <w:r>
         <w:rPr>
-          <w:rFonts w:ascii="Calibri" w:hAnsi="Calibri"/>
+          <w:rFonts w:ascii="Times New Roman" w:hAnsi="Times New Roman"/>
           <w:b/>
-          <w:color w:val="1E3A8A"/>
+          <w:color w:val="000000"/>
           <w:sz w:val="22"/>
         </w:rPr>
-        <w:t xml:space="preserve">Continuous Feature Scaling: </w:t>
+        <w:t xml:space="preserve">Continuous Scaling: </w:t>
       </w:r>
       <w:r>
         <w:rPr>
-          <w:rFonts w:ascii="Calibri" w:hAnsi="Calibri"/>
-          <w:color w:val="0F172A"/>
+          <w:rFonts w:ascii="Times New Roman" w:hAnsi="Times New Roman"/>
+          <w:color w:val="000000"/>
           <w:sz w:val="22"/>
         </w:rPr>
-        <w:t>duration, credit_amount, and age were scaled via StandardScaler to prevent large numerical ranges from dominating gradient updates.</w:t>
+        <w:t>StandardScaler was applied to duration, credit_amount, and age to normalize feature scales.</w:t>
       </w:r>
     </w:p>
     <w:p>
@@ -682,20 +712,20 @@
       </w:pPr>
       <w:r>
         <w:rPr>
-          <w:rFonts w:ascii="Calibri" w:hAnsi="Calibri"/>
+          <w:rFonts w:ascii="Times New Roman" w:hAnsi="Times New Roman"/>
           <w:b/>
-          <w:color w:val="1E3A8A"/>
+          <w:color w:val="000000"/>
           <w:sz w:val="22"/>
         </w:rPr>
         <w:t xml:space="preserve">Categorical Encoding: </w:t>
       </w:r>
       <w:r>
         <w:rPr>
-          <w:rFonts w:ascii="Calibri" w:hAnsi="Calibri"/>
-          <w:color w:val="0F172A"/>
+          <w:rFonts w:ascii="Times New Roman" w:hAnsi="Times New Roman"/>
+          <w:color w:val="000000"/>
           <w:sz w:val="22"/>
         </w:rPr>
-        <w:t>Categorical features (checking status, savings status, employment, housing, purpose) were transformed via OneHotEncoder with handle_unknown="ignore" to ensure production robustness.</w:t>
+        <w:t>OneHotEncoder with handle_unknown="ignore" was fitted on categorical variables (checking balance, savings balance, employment tenure, housing status, loan purpose).</w:t>
       </w:r>
     </w:p>
     <w:p>
@@ -705,20 +735,20 @@
       </w:pPr>
       <w:r>
         <w:rPr>
-          <w:rFonts w:ascii="Calibri" w:hAnsi="Calibri"/>
+          <w:rFonts w:ascii="Times New Roman" w:hAnsi="Times New Roman"/>
           <w:b/>
-          <w:color w:val="1E3A8A"/>
+          <w:color w:val="000000"/>
           <w:sz w:val="22"/>
         </w:rPr>
-        <w:t xml:space="preserve">Validation Split: </w:t>
+        <w:t xml:space="preserve">Partitioning: </w:t>
       </w:r>
       <w:r>
         <w:rPr>
-          <w:rFonts w:ascii="Calibri" w:hAnsi="Calibri"/>
-          <w:color w:val="0F172A"/>
+          <w:rFonts w:ascii="Times New Roman" w:hAnsi="Times New Roman"/>
+          <w:color w:val="000000"/>
           <w:sz w:val="22"/>
         </w:rPr>
-        <w:t>An 80/20 stratified split partitioned 800 training applicants and 200 holdout test records.</w:t>
+        <w:t>An 80/20 stratified split separated 800 training applicants and 200 holdout test cases.</w:t>
       </w:r>
     </w:p>
     <w:p>
@@ -727,10 +757,10 @@
       </w:pPr>
       <w:r>
         <w:rPr>
-          <w:rFonts w:ascii="Calibri" w:hAnsi="Calibri"/>
+          <w:rFonts w:ascii="Times New Roman" w:hAnsi="Times New Roman"/>
           <w:b/>
-          <w:color w:val="1E3A8A"/>
-          <w:sz w:val="28"/>
+          <w:color w:val="000000"/>
+          <w:sz w:val="26"/>
         </w:rPr>
         <w:t>5. Exploratory Data Analysis (EDA)</w:t>
       </w:r>
@@ -741,11 +771,11 @@
       </w:pPr>
       <w:r>
         <w:rPr>
-          <w:rFonts w:ascii="Calibri" w:hAnsi="Calibri"/>
-          <w:color w:val="0F172A"/>
+          <w:rFonts w:ascii="Times New Roman" w:hAnsi="Times New Roman"/>
+          <w:color w:val="000000"/>
           <w:sz w:val="22"/>
         </w:rPr>
-        <w:t>Empirical analysis of historical data revealed three primary solvency signals:</w:t>
+        <w:t>Empirical exploratory analysis revealed three primary credit default indicators:</w:t>
       </w:r>
     </w:p>
     <w:p>
@@ -755,20 +785,20 @@
       </w:pPr>
       <w:r>
         <w:rPr>
-          <w:rFonts w:ascii="Calibri" w:hAnsi="Calibri"/>
+          <w:rFonts w:ascii="Times New Roman" w:hAnsi="Times New Roman"/>
           <w:b/>
-          <w:color w:val="1E3A8A"/>
+          <w:color w:val="000000"/>
           <w:sz w:val="22"/>
         </w:rPr>
-        <w:t xml:space="preserve">Signal 1: Checking Account Liquidity (#1 Risk Factor): </w:t>
+        <w:t xml:space="preserve">Checking Balance Liquidity: </w:t>
       </w:r>
       <w:r>
         <w:rPr>
-          <w:rFonts w:ascii="Calibri" w:hAnsi="Calibri"/>
-          <w:color w:val="0F172A"/>
+          <w:rFonts w:ascii="Times New Roman" w:hAnsi="Times New Roman"/>
+          <w:color w:val="000000"/>
           <w:sz w:val="22"/>
         </w:rPr>
-        <w:t>Applicants with negative or overdrawn checking balances (&lt; 0 DM) experienced default rates approaching 49.3%, whereas applicants maintaining &gt;= 200 DM defaulted at under 14.5%.</w:t>
+        <w:t>Applicants with negative checking balances (&lt; 0 DM) exhibited an average default rate of 49.3%. Conversely, applicants with balances &gt;= 200 DM demonstrated default rates below 14.5%.</w:t>
       </w:r>
     </w:p>
     <w:p>
@@ -778,20 +808,20 @@
       </w:pPr>
       <w:r>
         <w:rPr>
-          <w:rFonts w:ascii="Calibri" w:hAnsi="Calibri"/>
+          <w:rFonts w:ascii="Times New Roman" w:hAnsi="Times New Roman"/>
           <w:b/>
-          <w:color w:val="1E3A8A"/>
+          <w:color w:val="000000"/>
           <w:sz w:val="22"/>
         </w:rPr>
-        <w:t xml:space="preserve">Signal 2: Amortization Horizon: </w:t>
+        <w:t xml:space="preserve">Amortization Horizon: </w:t>
       </w:r>
       <w:r>
         <w:rPr>
-          <w:rFonts w:ascii="Calibri" w:hAnsi="Calibri"/>
-          <w:color w:val="0F172A"/>
+          <w:rFonts w:ascii="Times New Roman" w:hAnsi="Times New Roman"/>
+          <w:color w:val="000000"/>
           <w:sz w:val="22"/>
         </w:rPr>
-        <w:t>Median loan duration for defaulters was 30 months compared to 18 months for repayers. Extended tenure compounds exposure to life shocks (unemployment, illness).</w:t>
+        <w:t>Median loan duration for defaulting accounts was 30 months compared to 18 months for performing accounts, demonstrating that longer tenures heighten vulnerability to life shocks.</w:t>
       </w:r>
     </w:p>
     <w:p>
@@ -801,20 +831,20 @@
       </w:pPr>
       <w:r>
         <w:rPr>
-          <w:rFonts w:ascii="Calibri" w:hAnsi="Calibri"/>
+          <w:rFonts w:ascii="Times New Roman" w:hAnsi="Times New Roman"/>
           <w:b/>
-          <w:color w:val="1E3A8A"/>
+          <w:color w:val="000000"/>
           <w:sz w:val="22"/>
         </w:rPr>
-        <w:t xml:space="preserve">Signal 3: Savings Buffer Resilience: </w:t>
+        <w:t xml:space="preserve">Savings Buffer: </w:t>
       </w:r>
       <w:r>
         <w:rPr>
-          <w:rFonts w:ascii="Calibri" w:hAnsi="Calibri"/>
-          <w:color w:val="0F172A"/>
+          <w:rFonts w:ascii="Times New Roman" w:hAnsi="Times New Roman"/>
+          <w:color w:val="000000"/>
           <w:sz w:val="22"/>
         </w:rPr>
-        <w:t>Applicants with savings &gt;= 1,000 DM maintained robust repayment even when requesting large credit amounts.</w:t>
+        <w:t>Applicants with savings reserves &gt;= 1,000 DM maintained resilient debt servicing even when borrowing larger amounts.</w:t>
       </w:r>
     </w:p>
     <w:p>
@@ -823,10 +853,10 @@
       </w:pPr>
       <w:r>
         <w:rPr>
-          <w:rFonts w:ascii="Calibri" w:hAnsi="Calibri"/>
+          <w:rFonts w:ascii="Times New Roman" w:hAnsi="Times New Roman"/>
           <w:b/>
-          <w:color w:val="1E3A8A"/>
-          <w:sz w:val="28"/>
+          <w:color w:val="000000"/>
+          <w:sz w:val="26"/>
         </w:rPr>
         <w:t>6. Machine Learning Methodology</w:t>
       </w:r>
@@ -837,11 +867,11 @@
       </w:pPr>
       <w:r>
         <w:rPr>
-          <w:rFonts w:ascii="Calibri" w:hAnsi="Calibri"/>
-          <w:color w:val="0F172A"/>
+          <w:rFonts w:ascii="Times New Roman" w:hAnsi="Times New Roman"/>
+          <w:color w:val="000000"/>
           <w:sz w:val="22"/>
         </w:rPr>
-        <w:t>We evaluated multiple classifiers and selected Random Forest Classifier (n_estimators=100, max_depth=6) as the production estimator for several core reasons:</w:t>
+        <w:t>We selected Random Forest Classifier (n_estimators=100, max_depth=6) as the core estimator for the following reasons:</w:t>
       </w:r>
     </w:p>
     <w:p>
@@ -851,20 +881,20 @@
       </w:pPr>
       <w:r>
         <w:rPr>
-          <w:rFonts w:ascii="Calibri" w:hAnsi="Calibri"/>
+          <w:rFonts w:ascii="Times New Roman" w:hAnsi="Times New Roman"/>
           <w:b/>
-          <w:color w:val="1E3A8A"/>
+          <w:color w:val="000000"/>
           <w:sz w:val="22"/>
         </w:rPr>
-        <w:t xml:space="preserve">Non-Linearity &amp; Interactions: </w:t>
+        <w:t xml:space="preserve">Non-Linear Feature Relationships: </w:t>
       </w:r>
       <w:r>
         <w:rPr>
-          <w:rFonts w:ascii="Calibri" w:hAnsi="Calibri"/>
-          <w:color w:val="0F172A"/>
+          <w:rFonts w:ascii="Times New Roman" w:hAnsi="Times New Roman"/>
+          <w:color w:val="000000"/>
           <w:sz w:val="22"/>
         </w:rPr>
-        <w:t>Credit risk involves complex multi-way interactions (e.g., high loan amount coupled with low savings). Tree ensembles naturally capture non-linear relationships without manual feature polynomialization.</w:t>
+        <w:t>Credit risk relationships are non-linear; tree ensembles naturally capture multi-way feature interactions.</w:t>
       </w:r>
     </w:p>
     <w:p>
@@ -874,20 +904,20 @@
       </w:pPr>
       <w:r>
         <w:rPr>
-          <w:rFonts w:ascii="Calibri" w:hAnsi="Calibri"/>
+          <w:rFonts w:ascii="Times New Roman" w:hAnsi="Times New Roman"/>
           <w:b/>
-          <w:color w:val="1E3A8A"/>
+          <w:color w:val="000000"/>
           <w:sz w:val="22"/>
         </w:rPr>
-        <w:t xml:space="preserve">Robustness to Outliers: </w:t>
+        <w:t xml:space="preserve">Resistance to Outliers: </w:t>
       </w:r>
       <w:r>
         <w:rPr>
-          <w:rFonts w:ascii="Calibri" w:hAnsi="Calibri"/>
-          <w:color w:val="0F172A"/>
+          <w:rFonts w:ascii="Times New Roman" w:hAnsi="Times New Roman"/>
+          <w:color w:val="000000"/>
           <w:sz w:val="22"/>
         </w:rPr>
-        <w:t>Tree partitioning is invariant to monotonic transformations, preventing extreme loan amounts from skewing decision boundaries.</w:t>
+        <w:t>Tree partitioning is robust against extreme credit amounts and durations.</w:t>
       </w:r>
     </w:p>
     <w:p>
@@ -897,20 +927,20 @@
       </w:pPr>
       <w:r>
         <w:rPr>
-          <w:rFonts w:ascii="Calibri" w:hAnsi="Calibri"/>
+          <w:rFonts w:ascii="Times New Roman" w:hAnsi="Times New Roman"/>
           <w:b/>
-          <w:color w:val="1E3A8A"/>
+          <w:color w:val="000000"/>
           <w:sz w:val="22"/>
         </w:rPr>
-        <w:t xml:space="preserve">Balanced Class Weighting: </w:t>
+        <w:t xml:space="preserve">Balanced Class Weights: </w:t>
       </w:r>
       <w:r>
         <w:rPr>
-          <w:rFonts w:ascii="Calibri" w:hAnsi="Calibri"/>
-          <w:color w:val="0F172A"/>
+          <w:rFonts w:ascii="Times New Roman" w:hAnsi="Times New Roman"/>
+          <w:color w:val="000000"/>
           <w:sz w:val="22"/>
         </w:rPr>
-        <w:t>Configured with class_weight="balanced", assigning dynamic loss penalties (w_bad ≈ 1.67 vs w_good ≈ 0.71). This penalizes misclassified defaulters 2.35x more heavily than false alarms.</w:t>
+        <w:t>The model was calibrated with class_weight="balanced", assigning dynamic loss penalties (w_bad ≈ 1.67 vs w_good ≈ 0.71). This penalizes misclassifying defaulters 2.35 times more heavily than false alarms.</w:t>
       </w:r>
     </w:p>
     <w:p>
@@ -919,10 +949,10 @@
       </w:pPr>
       <w:r>
         <w:rPr>
-          <w:rFonts w:ascii="Calibri" w:hAnsi="Calibri"/>
+          <w:rFonts w:ascii="Times New Roman" w:hAnsi="Times New Roman"/>
           <w:b/>
-          <w:color w:val="1E3A8A"/>
-          <w:sz w:val="28"/>
+          <w:color w:val="000000"/>
+          <w:sz w:val="26"/>
         </w:rPr>
         <w:t>7. Model Evaluation &amp; Performance</w:t>
       </w:r>
@@ -933,11 +963,11 @@
       </w:pPr>
       <w:r>
         <w:rPr>
-          <w:rFonts w:ascii="Calibri" w:hAnsi="Calibri"/>
-          <w:color w:val="0F172A"/>
+          <w:rFonts w:ascii="Times New Roman" w:hAnsi="Times New Roman"/>
+          <w:color w:val="000000"/>
           <w:sz w:val="22"/>
         </w:rPr>
-        <w:t>The model was evaluated on the 200 unseen holdout applicants (140 Good, 60 Bad):</w:t>
+        <w:t>Performance on the 200 unseen holdout test applicants (140 Good, 60 Bad):</w:t>
       </w:r>
     </w:p>
     <w:p>
@@ -947,17 +977,17 @@
       </w:pPr>
       <w:r>
         <w:rPr>
-          <w:rFonts w:ascii="Calibri" w:hAnsi="Calibri"/>
+          <w:rFonts w:ascii="Times New Roman" w:hAnsi="Times New Roman"/>
           <w:b/>
-          <w:color w:val="1E3A8A"/>
+          <w:color w:val="000000"/>
           <w:sz w:val="22"/>
         </w:rPr>
-        <w:t xml:space="preserve">Defaulter Recall (Primary KPI): </w:t>
+        <w:t xml:space="preserve">Defaulter Recall (Primary Metric): </w:t>
       </w:r>
       <w:r>
         <w:rPr>
-          <w:rFonts w:ascii="Calibri" w:hAnsi="Calibri"/>
-          <w:color w:val="0F172A"/>
+          <w:rFonts w:ascii="Times New Roman" w:hAnsi="Times New Roman"/>
+          <w:color w:val="000000"/>
           <w:sz w:val="22"/>
         </w:rPr>
         <w:t>71.7% (Successfully flagged 43 out of 60 actual defaulters).</w:t>
@@ -970,20 +1000,20 @@
       </w:pPr>
       <w:r>
         <w:rPr>
-          <w:rFonts w:ascii="Calibri" w:hAnsi="Calibri"/>
+          <w:rFonts w:ascii="Times New Roman" w:hAnsi="Times New Roman"/>
           <w:b/>
-          <w:color w:val="1E3A8A"/>
+          <w:color w:val="000000"/>
           <w:sz w:val="22"/>
         </w:rPr>
-        <w:t xml:space="preserve">Overall Accuracy: </w:t>
+        <w:t xml:space="preserve">Accuracy: </w:t>
       </w:r>
       <w:r>
         <w:rPr>
-          <w:rFonts w:ascii="Calibri" w:hAnsi="Calibri"/>
-          <w:color w:val="0F172A"/>
+          <w:rFonts w:ascii="Times New Roman" w:hAnsi="Times New Roman"/>
+          <w:color w:val="000000"/>
           <w:sz w:val="22"/>
         </w:rPr>
-        <w:t>70.0% (140 correct classifications out of 200).</w:t>
+        <w:t>70.0% (140 correct classifications out of 200 total test cases).</w:t>
       </w:r>
     </w:p>
     <w:p>
@@ -993,17 +1023,17 @@
       </w:pPr>
       <w:r>
         <w:rPr>
-          <w:rFonts w:ascii="Calibri" w:hAnsi="Calibri"/>
+          <w:rFonts w:ascii="Times New Roman" w:hAnsi="Times New Roman"/>
           <w:b/>
-          <w:color w:val="1E3A8A"/>
+          <w:color w:val="000000"/>
           <w:sz w:val="22"/>
         </w:rPr>
-        <w:t xml:space="preserve">Defaulter Precision: </w:t>
+        <w:t xml:space="preserve">Precision (Defaulters): </w:t>
       </w:r>
       <w:r>
         <w:rPr>
-          <w:rFonts w:ascii="Calibri" w:hAnsi="Calibri"/>
-          <w:color w:val="0F172A"/>
+          <w:rFonts w:ascii="Times New Roman" w:hAnsi="Times New Roman"/>
+          <w:color w:val="000000"/>
           <w:sz w:val="22"/>
         </w:rPr>
         <w:t>50.0% (43 True Positives vs. 43 False Positives).</w:t>
@@ -1016,17 +1046,17 @@
       </w:pPr>
       <w:r>
         <w:rPr>
-          <w:rFonts w:ascii="Calibri" w:hAnsi="Calibri"/>
+          <w:rFonts w:ascii="Times New Roman" w:hAnsi="Times New Roman"/>
           <w:b/>
-          <w:color w:val="1E3A8A"/>
+          <w:color w:val="000000"/>
           <w:sz w:val="22"/>
         </w:rPr>
         <w:t xml:space="preserve">F1-Score: </w:t>
       </w:r>
       <w:r>
         <w:rPr>
-          <w:rFonts w:ascii="Calibri" w:hAnsi="Calibri"/>
-          <w:color w:val="0F172A"/>
+          <w:rFonts w:ascii="Times New Roman" w:hAnsi="Times New Roman"/>
+          <w:color w:val="000000"/>
           <w:sz w:val="22"/>
         </w:rPr>
         <w:t>0.589.</w:t>
@@ -1039,20 +1069,20 @@
       </w:pPr>
       <w:r>
         <w:rPr>
-          <w:rFonts w:ascii="Calibri" w:hAnsi="Calibri"/>
+          <w:rFonts w:ascii="Times New Roman" w:hAnsi="Times New Roman"/>
           <w:b/>
-          <w:color w:val="1E3A8A"/>
+          <w:color w:val="000000"/>
           <w:sz w:val="22"/>
         </w:rPr>
-        <w:t xml:space="preserve">Confusion Matrix Breakdown: </w:t>
+        <w:t xml:space="preserve">Confusion Matrix: </w:t>
       </w:r>
       <w:r>
         <w:rPr>
-          <w:rFonts w:ascii="Calibri" w:hAnsi="Calibri"/>
-          <w:color w:val="0F172A"/>
+          <w:rFonts w:ascii="Times New Roman" w:hAnsi="Times New Roman"/>
+          <w:color w:val="000000"/>
           <w:sz w:val="22"/>
         </w:rPr>
-        <w:t>True Negatives: 97 | False Positives: 43 | False Negatives: 17 | True Positives: 43.</w:t>
+        <w:t>97 True Negatives, 43 False Positives, 17 False Negatives, and 43 True Positives.</w:t>
       </w:r>
     </w:p>
     <w:p>
@@ -1061,11 +1091,11 @@
       </w:pPr>
       <w:r>
         <w:rPr>
-          <w:rFonts w:ascii="Calibri" w:hAnsi="Calibri"/>
-          <w:color w:val="0F172A"/>
+          <w:rFonts w:ascii="Times New Roman" w:hAnsi="Times New Roman"/>
+          <w:color w:val="000000"/>
           <w:sz w:val="22"/>
         </w:rPr>
-        <w:t>Crucially, False Negatives were restricted to only 17 cases out of 60, successfully preventing over 71% of potential credit losses.</w:t>
+        <w:t>Importantly, False Negatives were limited to only 17 cases out of 60, successfully averting over 71% of potential credit default losses.</w:t>
       </w:r>
     </w:p>
     <w:p>
@@ -1074,10 +1104,10 @@
       </w:pPr>
       <w:r>
         <w:rPr>
-          <w:rFonts w:ascii="Calibri" w:hAnsi="Calibri"/>
+          <w:rFonts w:ascii="Times New Roman" w:hAnsi="Times New Roman"/>
           <w:b/>
-          <w:color w:val="1E3A8A"/>
-          <w:sz w:val="28"/>
+          <w:color w:val="000000"/>
+          <w:sz w:val="26"/>
         </w:rPr>
         <w:t>8. Streamlit Application Architecture</w:t>
       </w:r>
@@ -1088,11 +1118,11 @@
       </w:pPr>
       <w:r>
         <w:rPr>
-          <w:rFonts w:ascii="Calibri" w:hAnsi="Calibri"/>
-          <w:color w:val="0F172A"/>
+          <w:rFonts w:ascii="Times New Roman" w:hAnsi="Times New Roman"/>
+          <w:color w:val="000000"/>
           <w:sz w:val="22"/>
         </w:rPr>
-        <w:t>The fitted pipeline was serialized into model.pkl via joblib and embedded within a modern 3-page Streamlit web platform:</w:t>
+        <w:t>The trained pipeline was serialized into model.pkl using joblib and deployed as a 3-page interactive Streamlit platform:</w:t>
       </w:r>
     </w:p>
     <w:p>
@@ -1102,20 +1132,20 @@
       </w:pPr>
       <w:r>
         <w:rPr>
-          <w:rFonts w:ascii="Calibri" w:hAnsi="Calibri"/>
+          <w:rFonts w:ascii="Times New Roman" w:hAnsi="Times New Roman"/>
           <w:b/>
-          <w:color w:val="1E3A8A"/>
+          <w:color w:val="000000"/>
           <w:sz w:val="22"/>
         </w:rPr>
         <w:t xml:space="preserve">Page 1: Executive Overview: </w:t>
       </w:r>
       <w:r>
         <w:rPr>
-          <w:rFonts w:ascii="Calibri" w:hAnsi="Calibri"/>
-          <w:color w:val="0F172A"/>
+          <w:rFonts w:ascii="Times New Roman" w:hAnsi="Times New Roman"/>
+          <w:color w:val="000000"/>
           <w:sz w:val="22"/>
         </w:rPr>
-        <w:t>Presents the business context, asymmetric cost rationale, and high-level KPI cards.</w:t>
+        <w:t>Outlines institutional background, asymmetric cost matrix, and portfolio KPIs.</w:t>
       </w:r>
     </w:p>
     <w:p>
@@ -1125,20 +1155,20 @@
       </w:pPr>
       <w:r>
         <w:rPr>
-          <w:rFonts w:ascii="Calibri" w:hAnsi="Calibri"/>
+          <w:rFonts w:ascii="Times New Roman" w:hAnsi="Times New Roman"/>
           <w:b/>
-          <w:color w:val="1E3A8A"/>
+          <w:color w:val="000000"/>
           <w:sz w:val="22"/>
         </w:rPr>
         <w:t xml:space="preserve">Page 2: Portfolio Analytics: </w:t>
       </w:r>
       <w:r>
         <w:rPr>
-          <w:rFonts w:ascii="Calibri" w:hAnsi="Calibri"/>
-          <w:color w:val="0F172A"/>
+          <w:rFonts w:ascii="Times New Roman" w:hAnsi="Times New Roman"/>
+          <w:color w:val="000000"/>
           <w:sz w:val="22"/>
         </w:rPr>
-        <w:t>Interactive data exploration visualizing checking account solvency curves, tenure boxplots, and class distributions.</w:t>
+        <w:t>Presents empirical charts illustrating checking balance default curves, loan duration boxplots, and class distributions.</w:t>
       </w:r>
     </w:p>
     <w:p>
@@ -1148,20 +1178,20 @@
       </w:pPr>
       <w:r>
         <w:rPr>
-          <w:rFonts w:ascii="Calibri" w:hAnsi="Calibri"/>
+          <w:rFonts w:ascii="Times New Roman" w:hAnsi="Times New Roman"/>
           <w:b/>
-          <w:color w:val="1E3A8A"/>
+          <w:color w:val="000000"/>
           <w:sz w:val="22"/>
         </w:rPr>
         <w:t xml:space="preserve">Page 3: Underwriting Decision Engine: </w:t>
       </w:r>
       <w:r>
         <w:rPr>
-          <w:rFonts w:ascii="Calibri" w:hAnsi="Calibri"/>
-          <w:color w:val="0F172A"/>
+          <w:rFonts w:ascii="Times New Roman" w:hAnsi="Times New Roman"/>
+          <w:color w:val="000000"/>
           <w:sz w:val="22"/>
         </w:rPr>
-        <w:t>Point-of-sale portal where loan officers input borrower credentials and receive real-time probability scores and triaged directives.</w:t>
+        <w:t>Allows underwriters to input applicant details and receive real-time probability estimates and actionable policy recommendations.</w:t>
       </w:r>
     </w:p>
     <w:p>
@@ -1170,10 +1200,10 @@
       </w:pPr>
       <w:r>
         <w:rPr>
-          <w:rFonts w:ascii="Calibri" w:hAnsi="Calibri"/>
+          <w:rFonts w:ascii="Times New Roman" w:hAnsi="Times New Roman"/>
           <w:b/>
-          <w:color w:val="1E3A8A"/>
-          <w:sz w:val="28"/>
+          <w:color w:val="000000"/>
+          <w:sz w:val="26"/>
         </w:rPr>
         <w:t>9. Cloud Deployment</w:t>
       </w:r>
@@ -1184,11 +1214,11 @@
       </w:pPr>
       <w:r>
         <w:rPr>
-          <w:rFonts w:ascii="Calibri" w:hAnsi="Calibri"/>
-          <w:color w:val="0F172A"/>
+          <w:rFonts w:ascii="Times New Roman" w:hAnsi="Times New Roman"/>
+          <w:color w:val="000000"/>
           <w:sz w:val="22"/>
         </w:rPr>
-        <w:t>The application is version-controlled on GitHub and deployed on Streamlit Community Cloud:</w:t>
+        <w:t>The application is version-controlled on GitHub and deployed live via Streamlit Community Cloud:</w:t>
       </w:r>
     </w:p>
     <w:p>
@@ -1198,20 +1228,20 @@
       </w:pPr>
       <w:r>
         <w:rPr>
-          <w:rFonts w:ascii="Calibri" w:hAnsi="Calibri"/>
+          <w:rFonts w:ascii="Times New Roman" w:hAnsi="Times New Roman"/>
           <w:b/>
-          <w:color w:val="1E3A8A"/>
+          <w:color w:val="000000"/>
           <w:sz w:val="22"/>
         </w:rPr>
-        <w:t xml:space="preserve">CI/CD Integration: </w:t>
+        <w:t xml:space="preserve">Continuous Integration: </w:t>
       </w:r>
       <w:r>
         <w:rPr>
-          <w:rFonts w:ascii="Calibri" w:hAnsi="Calibri"/>
-          <w:color w:val="0F172A"/>
+          <w:rFonts w:ascii="Times New Roman" w:hAnsi="Times New Roman"/>
+          <w:color w:val="000000"/>
           <w:sz w:val="22"/>
         </w:rPr>
-        <w:t>Any commit pushed to the main branch automatically triggers container rebuilding and zero-downtime redeployment.</w:t>
+        <w:t>New commits to the main branch automatically trigger cloud container updates.</w:t>
       </w:r>
     </w:p>
     <w:p>
@@ -1221,20 +1251,20 @@
       </w:pPr>
       <w:r>
         <w:rPr>
-          <w:rFonts w:ascii="Calibri" w:hAnsi="Calibri"/>
+          <w:rFonts w:ascii="Times New Roman" w:hAnsi="Times New Roman"/>
           <w:b/>
-          <w:color w:val="1E3A8A"/>
+          <w:color w:val="000000"/>
           <w:sz w:val="22"/>
         </w:rPr>
-        <w:t xml:space="preserve">Environment Reproducibility: </w:t>
+        <w:t xml:space="preserve">Reproducibility: </w:t>
       </w:r>
       <w:r>
         <w:rPr>
-          <w:rFonts w:ascii="Calibri" w:hAnsi="Calibri"/>
-          <w:color w:val="0F172A"/>
+          <w:rFonts w:ascii="Times New Roman" w:hAnsi="Times New Roman"/>
+          <w:color w:val="000000"/>
           <w:sz w:val="22"/>
         </w:rPr>
-        <w:t>Dependencies are locked via requirements.txt, ensuring identical execution across cloud runtime environments.</w:t>
+        <w:t>Dependencies are locked in requirements.txt for cross-environment stability.</w:t>
       </w:r>
     </w:p>
     <w:p>
@@ -1243,10 +1273,10 @@
       </w:pPr>
       <w:r>
         <w:rPr>
-          <w:rFonts w:ascii="Calibri" w:hAnsi="Calibri"/>
+          <w:rFonts w:ascii="Times New Roman" w:hAnsi="Times New Roman"/>
           <w:b/>
-          <w:color w:val="1E3A8A"/>
-          <w:sz w:val="28"/>
+          <w:color w:val="000000"/>
+          <w:sz w:val="26"/>
         </w:rPr>
         <w:t>10. Key Business Insights</w:t>
       </w:r>
@@ -1258,20 +1288,20 @@
       </w:pPr>
       <w:r>
         <w:rPr>
-          <w:rFonts w:ascii="Calibri" w:hAnsi="Calibri"/>
+          <w:rFonts w:ascii="Times New Roman" w:hAnsi="Times New Roman"/>
           <w:b/>
-          <w:color w:val="1E3A8A"/>
+          <w:color w:val="000000"/>
           <w:sz w:val="22"/>
         </w:rPr>
-        <w:t xml:space="preserve">Insight 1: </w:t>
+        <w:t xml:space="preserve">Liquidity Dominance: </w:t>
       </w:r>
       <w:r>
         <w:rPr>
-          <w:rFonts w:ascii="Calibri" w:hAnsi="Calibri"/>
-          <w:color w:val="0F172A"/>
+          <w:rFonts w:ascii="Times New Roman" w:hAnsi="Times New Roman"/>
+          <w:color w:val="000000"/>
           <w:sz w:val="22"/>
         </w:rPr>
-        <w:t>Liquid cash buffers (checking and savings) are far more predictive of short-term credit solvency than demographic age.</w:t>
+        <w:t>Liquid checking and savings balances are significantly more predictive of creditworthiness than age or loan purpose.</w:t>
       </w:r>
     </w:p>
     <w:p>
@@ -1281,20 +1311,20 @@
       </w:pPr>
       <w:r>
         <w:rPr>
-          <w:rFonts w:ascii="Calibri" w:hAnsi="Calibri"/>
+          <w:rFonts w:ascii="Times New Roman" w:hAnsi="Times New Roman"/>
           <w:b/>
-          <w:color w:val="1E3A8A"/>
+          <w:color w:val="000000"/>
           <w:sz w:val="22"/>
         </w:rPr>
-        <w:t xml:space="preserve">Insight 2: </w:t>
+        <w:t xml:space="preserve">Tenure Exposure: </w:t>
       </w:r>
       <w:r>
         <w:rPr>
-          <w:rFonts w:ascii="Calibri" w:hAnsi="Calibri"/>
-          <w:color w:val="0F172A"/>
+          <w:rFonts w:ascii="Times New Roman" w:hAnsi="Times New Roman"/>
+          <w:color w:val="000000"/>
           <w:sz w:val="22"/>
         </w:rPr>
-        <w:t>Loan tenure is a risk multiplier. Restricting loan horizons to under 24 months reduces default exposure substantially.</w:t>
+        <w:t>Restricting unsecured consumer loan tenures to under 24 months reduces default susceptibility substantially.</w:t>
       </w:r>
     </w:p>
     <w:p>
@@ -1304,20 +1334,20 @@
       </w:pPr>
       <w:r>
         <w:rPr>
-          <w:rFonts w:ascii="Calibri" w:hAnsi="Calibri"/>
+          <w:rFonts w:ascii="Times New Roman" w:hAnsi="Times New Roman"/>
           <w:b/>
-          <w:color w:val="1E3A8A"/>
+          <w:color w:val="000000"/>
           <w:sz w:val="22"/>
         </w:rPr>
-        <w:t xml:space="preserve">Insight 3: </w:t>
+        <w:t xml:space="preserve">Threshold Flexibility: </w:t>
       </w:r>
       <w:r>
         <w:rPr>
-          <w:rFonts w:ascii="Calibri" w:hAnsi="Calibri"/>
-          <w:color w:val="0F172A"/>
+          <w:rFonts w:ascii="Times New Roman" w:hAnsi="Times New Roman"/>
+          <w:color w:val="000000"/>
           <w:sz w:val="22"/>
         </w:rPr>
-        <w:t>Threshold tuning enables banks to adapt to shifting macroeconomic cycles: tightening approval thresholds during recessions and expanding them during expansionary phases.</w:t>
+        <w:t>Threshold tuning allows credit risk committees to tighten or loosen approval bands based on prevailing macroeconomic liquidity.</w:t>
       </w:r>
     </w:p>
     <w:p>
@@ -1326,10 +1356,10 @@
       </w:pPr>
       <w:r>
         <w:rPr>
-          <w:rFonts w:ascii="Calibri" w:hAnsi="Calibri"/>
+          <w:rFonts w:ascii="Times New Roman" w:hAnsi="Times New Roman"/>
           <w:b/>
-          <w:color w:val="1E3A8A"/>
-          <w:sz w:val="28"/>
+          <w:color w:val="000000"/>
+          <w:sz w:val="26"/>
         </w:rPr>
         <w:t>11. Limitations</w:t>
       </w:r>
@@ -1341,20 +1371,20 @@
       </w:pPr>
       <w:r>
         <w:rPr>
-          <w:rFonts w:ascii="Calibri" w:hAnsi="Calibri"/>
+          <w:rFonts w:ascii="Times New Roman" w:hAnsi="Times New Roman"/>
           <w:b/>
-          <w:color w:val="1E3A8A"/>
+          <w:color w:val="000000"/>
           <w:sz w:val="22"/>
         </w:rPr>
         <w:t xml:space="preserve">Sample Size: </w:t>
       </w:r>
       <w:r>
         <w:rPr>
-          <w:rFonts w:ascii="Calibri" w:hAnsi="Calibri"/>
-          <w:color w:val="0F172A"/>
+          <w:rFonts w:ascii="Times New Roman" w:hAnsi="Times New Roman"/>
+          <w:color w:val="000000"/>
           <w:sz w:val="22"/>
         </w:rPr>
-        <w:t>The model is trained on 1,000 historical records; commercial enterprise scorecards typically utilize millions of bureau records.</w:t>
+        <w:t>The model is trained on 1,000 historical records; commercial bank scorecards typically utilize millions of bureau records.</w:t>
       </w:r>
     </w:p>
     <w:p>
@@ -1364,20 +1394,20 @@
       </w:pPr>
       <w:r>
         <w:rPr>
-          <w:rFonts w:ascii="Calibri" w:hAnsi="Calibri"/>
+          <w:rFonts w:ascii="Times New Roman" w:hAnsi="Times New Roman"/>
           <w:b/>
-          <w:color w:val="1E3A8A"/>
+          <w:color w:val="000000"/>
           <w:sz w:val="22"/>
         </w:rPr>
-        <w:t xml:space="preserve">Macroeconomic Omission: </w:t>
+        <w:t xml:space="preserve">Macroeconomic Blindspots: </w:t>
       </w:r>
       <w:r>
         <w:rPr>
-          <w:rFonts w:ascii="Calibri" w:hAnsi="Calibri"/>
-          <w:color w:val="0F172A"/>
+          <w:rFonts w:ascii="Times New Roman" w:hAnsi="Times New Roman"/>
+          <w:color w:val="000000"/>
           <w:sz w:val="22"/>
         </w:rPr>
-        <w:t>The dataset lacks external macro factors (inflation rate, central bank prime lending rate, regional unemployment rates).</w:t>
+        <w:t>The dataset omits systemic macroeconomic variables (inflation rates, benchmark interest rates, regional employment).</w:t>
       </w:r>
     </w:p>
     <w:p>
@@ -1387,20 +1417,20 @@
       </w:pPr>
       <w:r>
         <w:rPr>
-          <w:rFonts w:ascii="Calibri" w:hAnsi="Calibri"/>
+          <w:rFonts w:ascii="Times New Roman" w:hAnsi="Times New Roman"/>
           <w:b/>
-          <w:color w:val="1E3A8A"/>
+          <w:color w:val="000000"/>
           <w:sz w:val="22"/>
         </w:rPr>
-        <w:t xml:space="preserve">Temporal Drift: </w:t>
+        <w:t xml:space="preserve">Temporal Concept Drift: </w:t>
       </w:r>
       <w:r>
         <w:rPr>
-          <w:rFonts w:ascii="Calibri" w:hAnsi="Calibri"/>
-          <w:color w:val="0F172A"/>
+          <w:rFonts w:ascii="Times New Roman" w:hAnsi="Times New Roman"/>
+          <w:color w:val="000000"/>
           <w:sz w:val="22"/>
         </w:rPr>
-        <w:t>Consumer repayment behaviors shift over time; the model requires quarterly performance re-validation.</w:t>
+        <w:t>Borrower behavior changes over time, requiring quarterly retraining and monitoring.</w:t>
       </w:r>
     </w:p>
     <w:p>
@@ -1409,10 +1439,10 @@
       </w:pPr>
       <w:r>
         <w:rPr>
-          <w:rFonts w:ascii="Calibri" w:hAnsi="Calibri"/>
+          <w:rFonts w:ascii="Times New Roman" w:hAnsi="Times New Roman"/>
           <w:b/>
-          <w:color w:val="1E3A8A"/>
-          <w:sz w:val="28"/>
+          <w:color w:val="000000"/>
+          <w:sz w:val="26"/>
         </w:rPr>
         <w:t>12. Recommendations for Implementation</w:t>
       </w:r>
@@ -1424,20 +1454,20 @@
       </w:pPr>
       <w:r>
         <w:rPr>
-          <w:rFonts w:ascii="Calibri" w:hAnsi="Calibri"/>
+          <w:rFonts w:ascii="Times New Roman" w:hAnsi="Times New Roman"/>
           <w:b/>
-          <w:color w:val="1E3A8A"/>
+          <w:color w:val="000000"/>
           <w:sz w:val="22"/>
         </w:rPr>
-        <w:t xml:space="preserve">Human-in-the-Loop Framework: </w:t>
+        <w:t xml:space="preserve">Decision-Support Architecture: </w:t>
       </w:r>
       <w:r>
         <w:rPr>
-          <w:rFonts w:ascii="Calibri" w:hAnsi="Calibri"/>
-          <w:color w:val="0F172A"/>
+          <w:rFonts w:ascii="Times New Roman" w:hAnsi="Times New Roman"/>
+          <w:color w:val="000000"/>
           <w:sz w:val="22"/>
         </w:rPr>
-        <w:t>Deploy as a decision-support tool rather than an autonomous decision-maker.</w:t>
+        <w:t>Deploy as an advisory tool with human-in-the-loop oversight.</w:t>
       </w:r>
     </w:p>
     <w:p>
@@ -1447,20 +1477,20 @@
       </w:pPr>
       <w:r>
         <w:rPr>
-          <w:rFonts w:ascii="Calibri" w:hAnsi="Calibri"/>
+          <w:rFonts w:ascii="Times New Roman" w:hAnsi="Times New Roman"/>
           <w:b/>
-          <w:color w:val="1E3A8A"/>
+          <w:color w:val="000000"/>
           <w:sz w:val="22"/>
         </w:rPr>
         <w:t xml:space="preserve">Triaged Workflow: </w:t>
       </w:r>
       <w:r>
         <w:rPr>
-          <w:rFonts w:ascii="Calibri" w:hAnsi="Calibri"/>
-          <w:color w:val="0F172A"/>
+          <w:rFonts w:ascii="Times New Roman" w:hAnsi="Times New Roman"/>
+          <w:color w:val="000000"/>
           <w:sz w:val="22"/>
         </w:rPr>
-        <w:t>Automate straight-through processing for Green Tier applicants (&lt;35% risk), while routing Yellow Tier applicants (35%-55%) to senior underwriters for co-signer or collateral verification.</w:t>
+        <w:t>Automate approvals for low-risk applicants (&lt;35% risk), route borderline applicants (35%-55%) for collateral/co-signer review, and decline high-risk applications (&gt;55%).</w:t>
       </w:r>
     </w:p>
     <w:p>
@@ -1470,20 +1500,20 @@
       </w:pPr>
       <w:r>
         <w:rPr>
-          <w:rFonts w:ascii="Calibri" w:hAnsi="Calibri"/>
+          <w:rFonts w:ascii="Times New Roman" w:hAnsi="Times New Roman"/>
           <w:b/>
-          <w:color w:val="1E3A8A"/>
+          <w:color w:val="000000"/>
           <w:sz w:val="22"/>
         </w:rPr>
-        <w:t xml:space="preserve">Dynamic Pricing: </w:t>
+        <w:t xml:space="preserve">Risk-Based Pricing: </w:t>
       </w:r>
       <w:r>
         <w:rPr>
-          <w:rFonts w:ascii="Calibri" w:hAnsi="Calibri"/>
-          <w:color w:val="0F172A"/>
+          <w:rFonts w:ascii="Times New Roman" w:hAnsi="Times New Roman"/>
+          <w:color w:val="000000"/>
           <w:sz w:val="22"/>
         </w:rPr>
-        <w:t>Incorporate risk-based pricing, adding interest rate spreads (e.g., +200 bps) to borderline approvals to compensate for residual credit risk.</w:t>
+        <w:t>Apply interest rate spreads on borderline approvals to compensate for incremental risk.</w:t>
       </w:r>
     </w:p>
     <w:p>
@@ -1492,10 +1522,10 @@
       </w:pPr>
       <w:r>
         <w:rPr>
-          <w:rFonts w:ascii="Calibri" w:hAnsi="Calibri"/>
+          <w:rFonts w:ascii="Times New Roman" w:hAnsi="Times New Roman"/>
           <w:b/>
-          <w:color w:val="1E3A8A"/>
-          <w:sz w:val="28"/>
+          <w:color w:val="000000"/>
+          <w:sz w:val="26"/>
         </w:rPr>
         <w:t>13. Conclusion</w:t>
       </w:r>
@@ -1506,11 +1536,11 @@
       </w:pPr>
       <w:r>
         <w:rPr>
-          <w:rFonts w:ascii="Calibri" w:hAnsi="Calibri"/>
-          <w:color w:val="0F172A"/>
+          <w:rFonts w:ascii="Times New Roman" w:hAnsi="Times New Roman"/>
+          <w:color w:val="000000"/>
           <w:sz w:val="22"/>
         </w:rPr>
-        <w:t>This project demonstrates the full lifecycle of a business analytics solution: translating a strategic banking dilemma into an empirical machine learning pipeline and deploying an interactive decision tool. By calibrating Random Forest with balanced class weights, the system catches 71.7% of high-risk defaulters, balancing balance-sheet protection with customer acquisition margin.</w:t>
+        <w:t>This project demonstrates the complete lifecycle of a business analytics solution: translating a business problem into a calibrated machine learning pipeline and deploying an interactive decision support tool. By applying balanced class weights within a Random Forest classifier, the system captures 71.7% of high-risk defaulters, balancing balance-sheet protection with customer acquisition margin.</w:t>
       </w:r>
     </w:p>
     <w:p>
@@ -1519,10 +1549,10 @@
       </w:pPr>
       <w:r>
         <w:rPr>
-          <w:rFonts w:ascii="Calibri" w:hAnsi="Calibri"/>
+          <w:rFonts w:ascii="Times New Roman" w:hAnsi="Times New Roman"/>
           <w:b/>
-          <w:color w:val="1E3A8A"/>
-          <w:sz w:val="28"/>
+          <w:color w:val="000000"/>
+          <w:sz w:val="26"/>
         </w:rPr>
         <w:t>14. Project Repository &amp; Deployment Links</w:t>
       </w:r>
@@ -1534,17 +1564,17 @@
       </w:pPr>
       <w:r>
         <w:rPr>
-          <w:rFonts w:ascii="Calibri" w:hAnsi="Calibri"/>
+          <w:rFonts w:ascii="Times New Roman" w:hAnsi="Times New Roman"/>
           <w:b/>
-          <w:color w:val="1E3A8A"/>
+          <w:color w:val="000000"/>
           <w:sz w:val="22"/>
         </w:rPr>
         <w:t xml:space="preserve">GitHub Repository: </w:t>
       </w:r>
       <w:r>
         <w:rPr>
-          <w:rFonts w:ascii="Calibri" w:hAnsi="Calibri"/>
-          <w:color w:val="0F172A"/>
+          <w:rFonts w:ascii="Times New Roman" w:hAnsi="Times New Roman"/>
+          <w:color w:val="000000"/>
           <w:sz w:val="22"/>
         </w:rPr>
         <w:t>https://github.com/Akshit226/streamlit-app-MLBA-02-</w:t>
@@ -1557,17 +1587,17 @@
       </w:pPr>
       <w:r>
         <w:rPr>
-          <w:rFonts w:ascii="Calibri" w:hAnsi="Calibri"/>
+          <w:rFonts w:ascii="Times New Roman" w:hAnsi="Times New Roman"/>
           <w:b/>
-          <w:color w:val="1E3A8A"/>
+          <w:color w:val="000000"/>
           <w:sz w:val="22"/>
         </w:rPr>
         <w:t xml:space="preserve">Live Application URL: </w:t>
       </w:r>
       <w:r>
         <w:rPr>
-          <w:rFonts w:ascii="Calibri" w:hAnsi="Calibri"/>
-          <w:color w:val="0F172A"/>
+          <w:rFonts w:ascii="Times New Roman" w:hAnsi="Times New Roman"/>
+          <w:color w:val="000000"/>
           <w:sz w:val="22"/>
         </w:rPr>
         <w:t>https://streamlit-app-mlba-02.streamlit.app</w:t>
@@ -1575,7 +1605,7 @@
     </w:p>
     <w:sectPr>
       <w:pgSz w:w="12240" w:h="15840"/>
-      <w:pgMar w:top="1152" w:right="1440" w:bottom="1152" w:left="1440" w:header="720" w:footer="720" w:gutter="0"/>
+      <w:pgMar w:top="1440" w:right="1440" w:bottom="1440" w:left="1440" w:header="720" w:footer="720" w:gutter="0"/>
       <w:cols w:space="720"/>
       <w:docGrid w:linePitch="360"/>
     </w:sectPr>

</xml_diff>

<commit_message>
Update live Streamlit application URL to active verified deployment link across all documentation, slides, and reports
</commit_message>
<xml_diff>
--- a/MLBA_Assignment_2_Project_Report.docx
+++ b/MLBA_Assignment_2_Project_Report.docx
@@ -392,7 +392,7 @@
         <w:br/>
         <w:t>• GitHub Repository: https://github.com/Akshit226/streamlit-app-MLBA-02-</w:t>
         <w:br/>
-        <w:t>• Deployed Application: https://streamlit-app-mlba-02.streamlit.app</w:t>
+        <w:t>• Deployed Application: https://akshit226-streamlit-app-mlba-02--app-hemxe8.streamlit.app/</w:t>
       </w:r>
     </w:p>
     <w:p>
@@ -1600,7 +1600,7 @@
           <w:color w:val="000000"/>
           <w:sz w:val="22"/>
         </w:rPr>
-        <w:t>https://streamlit-app-mlba-02.streamlit.app</w:t>
+        <w:t>https://akshit226-streamlit-app-mlba-02--app-hemxe8.streamlit.app/</w:t>
       </w:r>
     </w:p>
     <w:sectPr>

</xml_diff>